<commit_message>
sprint 3 il reste validation et upload preuves documents
</commit_message>
<xml_diff>
--- a/uploads/Sprint 1.docx
+++ b/uploads/Sprint 1.docx
@@ -358,26 +358,14 @@
               <w:rPr>
                 <w:lang w:val="fr-FR"/>
               </w:rPr>
-              <w:t xml:space="preserve">vérifier </w:t>
-            </w:r>
-            <w:r>
-              <w:rPr>
-                <w:lang w:val="fr-FR"/>
-              </w:rPr>
-              <w:t xml:space="preserve"> les</w:t>
+              <w:t>vérifier  les</w:t>
             </w:r>
             <w:proofErr w:type="gramEnd"/>
             <w:r>
               <w:rPr>
                 <w:lang w:val="fr-FR"/>
               </w:rPr>
-              <w:t xml:space="preserve"> informations</w:t>
-            </w:r>
-            <w:r>
-              <w:rPr>
-                <w:lang w:val="fr-FR"/>
-              </w:rPr>
-              <w:t xml:space="preserve"> saisies</w:t>
+              <w:t xml:space="preserve"> informations saisies</w:t>
             </w:r>
           </w:p>
         </w:tc>
@@ -2152,13 +2140,7 @@
               <w:rPr>
                 <w:lang w:val="fr-FR"/>
               </w:rPr>
-              <w:t xml:space="preserve"> </w:t>
-            </w:r>
-            <w:r>
-              <w:rPr>
-                <w:lang w:val="fr-FR"/>
-              </w:rPr>
-              <w:t>d</w:t>
+              <w:t xml:space="preserve"> d</w:t>
             </w:r>
             <w:r>
               <w:rPr>
@@ -7301,38 +7283,24 @@
           </w:tcPr>
           <w:p>
             <w:pPr>
-              <w:ind w:left="360"/>
-              <w:rPr>
-                <w:sz w:val="28"/>
-                <w:szCs w:val="28"/>
-                <w:lang w:val="fr-TN" w:bidi="ar-TN"/>
-              </w:rPr>
-            </w:pPr>
-            <w:r>
-              <w:rPr>
-                <w:sz w:val="28"/>
-                <w:szCs w:val="28"/>
-                <w:lang w:val="fr-FR"/>
-              </w:rPr>
-              <w:t>1.</w:t>
-            </w:r>
-          </w:p>
-          <w:p>
-            <w:pPr>
-              <w:ind w:left="360"/>
-              <w:rPr>
-                <w:sz w:val="28"/>
-                <w:szCs w:val="28"/>
-                <w:lang w:val="fr-FR"/>
-              </w:rPr>
-            </w:pPr>
-            <w:r>
-              <w:rPr>
-                <w:sz w:val="28"/>
-                <w:szCs w:val="28"/>
-                <w:lang w:val="fr-FR"/>
-              </w:rPr>
-              <w:t>2.L</w:t>
+              <w:pStyle w:val="Paragraphedeliste"/>
+              <w:numPr>
+                <w:ilvl w:val="0"/>
+                <w:numId w:val="23"/>
+              </w:numPr>
+              <w:rPr>
+                <w:sz w:val="28"/>
+                <w:szCs w:val="28"/>
+                <w:lang w:val="fr-FR"/>
+              </w:rPr>
+            </w:pPr>
+            <w:r>
+              <w:rPr>
+                <w:sz w:val="28"/>
+                <w:szCs w:val="28"/>
+                <w:lang w:val="fr-FR"/>
+              </w:rPr>
+              <w:t>L</w:t>
             </w:r>
             <w:r>
               <w:rPr>
@@ -7361,21 +7329,17 @@
           </w:p>
           <w:p>
             <w:pPr>
-              <w:ind w:left="360"/>
-              <w:rPr>
-                <w:sz w:val="28"/>
-                <w:szCs w:val="28"/>
-                <w:lang w:val="fr-FR"/>
-              </w:rPr>
-            </w:pPr>
-            <w:r>
-              <w:rPr>
-                <w:sz w:val="28"/>
-                <w:szCs w:val="28"/>
-                <w:lang w:val="fr-FR"/>
-              </w:rPr>
-              <w:t>3.</w:t>
-            </w:r>
+              <w:pStyle w:val="Paragraphedeliste"/>
+              <w:numPr>
+                <w:ilvl w:val="0"/>
+                <w:numId w:val="23"/>
+              </w:numPr>
+              <w:rPr>
+                <w:sz w:val="28"/>
+                <w:szCs w:val="28"/>
+                <w:lang w:val="fr-FR"/>
+              </w:rPr>
+            </w:pPr>
             <w:r>
               <w:rPr>
                 <w:sz w:val="28"/>
@@ -7387,20 +7351,24 @@
           </w:p>
           <w:p>
             <w:pPr>
-              <w:ind w:left="360"/>
-              <w:rPr>
-                <w:sz w:val="28"/>
-                <w:szCs w:val="28"/>
-                <w:lang w:val="fr-FR"/>
-              </w:rPr>
-            </w:pPr>
-            <w:r>
-              <w:rPr>
-                <w:sz w:val="28"/>
-                <w:szCs w:val="28"/>
-                <w:lang w:val="fr-FR"/>
-              </w:rPr>
-              <w:t>4.L</w:t>
+              <w:pStyle w:val="Paragraphedeliste"/>
+              <w:numPr>
+                <w:ilvl w:val="0"/>
+                <w:numId w:val="23"/>
+              </w:numPr>
+              <w:rPr>
+                <w:sz w:val="28"/>
+                <w:szCs w:val="28"/>
+                <w:lang w:val="fr-FR"/>
+              </w:rPr>
+            </w:pPr>
+            <w:r>
+              <w:rPr>
+                <w:sz w:val="28"/>
+                <w:szCs w:val="28"/>
+                <w:lang w:val="fr-FR"/>
+              </w:rPr>
+              <w:t>L</w:t>
             </w:r>
             <w:r>
               <w:rPr>
@@ -7431,20 +7399,24 @@
           </w:p>
           <w:p>
             <w:pPr>
-              <w:ind w:left="360"/>
-              <w:rPr>
-                <w:sz w:val="28"/>
-                <w:szCs w:val="28"/>
-                <w:lang w:val="fr-FR"/>
-              </w:rPr>
-            </w:pPr>
-            <w:r>
-              <w:rPr>
-                <w:sz w:val="28"/>
-                <w:szCs w:val="28"/>
-                <w:lang w:val="fr-FR"/>
-              </w:rPr>
-              <w:t>5.L</w:t>
+              <w:pStyle w:val="Paragraphedeliste"/>
+              <w:numPr>
+                <w:ilvl w:val="0"/>
+                <w:numId w:val="23"/>
+              </w:numPr>
+              <w:rPr>
+                <w:sz w:val="28"/>
+                <w:szCs w:val="28"/>
+                <w:lang w:val="fr-FR"/>
+              </w:rPr>
+            </w:pPr>
+            <w:r>
+              <w:rPr>
+                <w:sz w:val="28"/>
+                <w:szCs w:val="28"/>
+                <w:lang w:val="fr-FR"/>
+              </w:rPr>
+              <w:t>L</w:t>
             </w:r>
             <w:r>
               <w:rPr>
@@ -7501,20 +7473,24 @@
           </w:p>
           <w:p>
             <w:pPr>
-              <w:ind w:left="360"/>
-              <w:rPr>
-                <w:sz w:val="28"/>
-                <w:szCs w:val="28"/>
-                <w:lang w:val="fr-FR"/>
-              </w:rPr>
-            </w:pPr>
-            <w:r>
-              <w:rPr>
-                <w:sz w:val="28"/>
-                <w:szCs w:val="28"/>
-                <w:lang w:val="fr-FR"/>
-              </w:rPr>
-              <w:t xml:space="preserve">6.Le </w:t>
+              <w:pStyle w:val="Paragraphedeliste"/>
+              <w:numPr>
+                <w:ilvl w:val="0"/>
+                <w:numId w:val="23"/>
+              </w:numPr>
+              <w:rPr>
+                <w:sz w:val="28"/>
+                <w:szCs w:val="28"/>
+                <w:lang w:val="fr-FR"/>
+              </w:rPr>
+            </w:pPr>
+            <w:r>
+              <w:rPr>
+                <w:sz w:val="28"/>
+                <w:szCs w:val="28"/>
+                <w:lang w:val="fr-FR"/>
+              </w:rPr>
+              <w:t xml:space="preserve">Le </w:t>
             </w:r>
             <w:proofErr w:type="spellStart"/>
             <w:r>
@@ -7553,28 +7529,24 @@
           </w:p>
           <w:p>
             <w:pPr>
-              <w:ind w:left="360"/>
-              <w:rPr>
-                <w:sz w:val="28"/>
-                <w:szCs w:val="28"/>
-                <w:lang w:val="fr-FR"/>
-              </w:rPr>
-            </w:pPr>
-            <w:r>
-              <w:rPr>
-                <w:sz w:val="28"/>
-                <w:szCs w:val="28"/>
-                <w:lang w:val="fr-FR"/>
-              </w:rPr>
-              <w:t>7</w:t>
-            </w:r>
-            <w:r>
-              <w:rPr>
-                <w:sz w:val="28"/>
-                <w:szCs w:val="28"/>
-                <w:lang w:val="fr-FR"/>
-              </w:rPr>
-              <w:t xml:space="preserve">.Le </w:t>
+              <w:pStyle w:val="Paragraphedeliste"/>
+              <w:numPr>
+                <w:ilvl w:val="0"/>
+                <w:numId w:val="23"/>
+              </w:numPr>
+              <w:rPr>
+                <w:sz w:val="28"/>
+                <w:szCs w:val="28"/>
+                <w:lang w:val="fr-FR"/>
+              </w:rPr>
+            </w:pPr>
+            <w:r>
+              <w:rPr>
+                <w:sz w:val="28"/>
+                <w:szCs w:val="28"/>
+                <w:lang w:val="fr-FR"/>
+              </w:rPr>
+              <w:t xml:space="preserve">Le </w:t>
             </w:r>
             <w:proofErr w:type="spellStart"/>
             <w:r>
@@ -7597,20 +7569,24 @@
           </w:p>
           <w:p>
             <w:pPr>
-              <w:ind w:left="360"/>
-              <w:rPr>
-                <w:sz w:val="28"/>
-                <w:szCs w:val="28"/>
-                <w:lang w:val="fr-FR"/>
-              </w:rPr>
-            </w:pPr>
-            <w:r>
-              <w:rPr>
-                <w:sz w:val="28"/>
-                <w:szCs w:val="28"/>
-                <w:lang w:val="fr-FR"/>
-              </w:rPr>
-              <w:t xml:space="preserve">8.Le </w:t>
+              <w:pStyle w:val="Paragraphedeliste"/>
+              <w:numPr>
+                <w:ilvl w:val="0"/>
+                <w:numId w:val="23"/>
+              </w:numPr>
+              <w:rPr>
+                <w:sz w:val="28"/>
+                <w:szCs w:val="28"/>
+                <w:lang w:val="fr-FR"/>
+              </w:rPr>
+            </w:pPr>
+            <w:r>
+              <w:rPr>
+                <w:sz w:val="28"/>
+                <w:szCs w:val="28"/>
+                <w:lang w:val="fr-FR"/>
+              </w:rPr>
+              <w:t xml:space="preserve">Le </w:t>
             </w:r>
             <w:proofErr w:type="spellStart"/>
             <w:r>
@@ -13013,6 +12989,92 @@
       </w:rPr>
     </w:lvl>
   </w:abstractNum>
+  <w:abstractNum w:abstractNumId="22" w15:restartNumberingAfterBreak="0">
+    <w:nsid w:val="79755A1E"/>
+    <w:multiLevelType w:val="hybridMultilevel"/>
+    <w:tmpl w:val="F69AF4F4"/>
+    <w:lvl w:ilvl="0" w:tplc="0409000F">
+      <w:start w:val="1"/>
+      <w:numFmt w:val="decimal"/>
+      <w:lvlText w:val="%1."/>
+      <w:lvlJc w:val="left"/>
+      <w:pPr>
+        <w:ind w:left="720" w:hanging="360"/>
+      </w:pPr>
+    </w:lvl>
+    <w:lvl w:ilvl="1" w:tplc="04090019" w:tentative="1">
+      <w:start w:val="1"/>
+      <w:numFmt w:val="lowerLetter"/>
+      <w:lvlText w:val="%2."/>
+      <w:lvlJc w:val="left"/>
+      <w:pPr>
+        <w:ind w:left="1440" w:hanging="360"/>
+      </w:pPr>
+    </w:lvl>
+    <w:lvl w:ilvl="2" w:tplc="0409001B" w:tentative="1">
+      <w:start w:val="1"/>
+      <w:numFmt w:val="lowerRoman"/>
+      <w:lvlText w:val="%3."/>
+      <w:lvlJc w:val="right"/>
+      <w:pPr>
+        <w:ind w:left="2160" w:hanging="180"/>
+      </w:pPr>
+    </w:lvl>
+    <w:lvl w:ilvl="3" w:tplc="0409000F" w:tentative="1">
+      <w:start w:val="1"/>
+      <w:numFmt w:val="decimal"/>
+      <w:lvlText w:val="%4."/>
+      <w:lvlJc w:val="left"/>
+      <w:pPr>
+        <w:ind w:left="2880" w:hanging="360"/>
+      </w:pPr>
+    </w:lvl>
+    <w:lvl w:ilvl="4" w:tplc="04090019" w:tentative="1">
+      <w:start w:val="1"/>
+      <w:numFmt w:val="lowerLetter"/>
+      <w:lvlText w:val="%5."/>
+      <w:lvlJc w:val="left"/>
+      <w:pPr>
+        <w:ind w:left="3600" w:hanging="360"/>
+      </w:pPr>
+    </w:lvl>
+    <w:lvl w:ilvl="5" w:tplc="0409001B" w:tentative="1">
+      <w:start w:val="1"/>
+      <w:numFmt w:val="lowerRoman"/>
+      <w:lvlText w:val="%6."/>
+      <w:lvlJc w:val="right"/>
+      <w:pPr>
+        <w:ind w:left="4320" w:hanging="180"/>
+      </w:pPr>
+    </w:lvl>
+    <w:lvl w:ilvl="6" w:tplc="0409000F" w:tentative="1">
+      <w:start w:val="1"/>
+      <w:numFmt w:val="decimal"/>
+      <w:lvlText w:val="%7."/>
+      <w:lvlJc w:val="left"/>
+      <w:pPr>
+        <w:ind w:left="5040" w:hanging="360"/>
+      </w:pPr>
+    </w:lvl>
+    <w:lvl w:ilvl="7" w:tplc="04090019" w:tentative="1">
+      <w:start w:val="1"/>
+      <w:numFmt w:val="lowerLetter"/>
+      <w:lvlText w:val="%8."/>
+      <w:lvlJc w:val="left"/>
+      <w:pPr>
+        <w:ind w:left="5760" w:hanging="360"/>
+      </w:pPr>
+    </w:lvl>
+    <w:lvl w:ilvl="8" w:tplc="0409001B" w:tentative="1">
+      <w:start w:val="1"/>
+      <w:numFmt w:val="lowerRoman"/>
+      <w:lvlText w:val="%9."/>
+      <w:lvlJc w:val="right"/>
+      <w:pPr>
+        <w:ind w:left="6480" w:hanging="180"/>
+      </w:pPr>
+    </w:lvl>
+  </w:abstractNum>
   <w:num w:numId="1" w16cid:durableId="1814829170">
     <w:abstractNumId w:val="11"/>
   </w:num>
@@ -13078,6 +13140,9 @@
   </w:num>
   <w:num w:numId="22" w16cid:durableId="878200241">
     <w:abstractNumId w:val="21"/>
+  </w:num>
+  <w:num w:numId="23" w16cid:durableId="1701123279">
+    <w:abstractNumId w:val="22"/>
   </w:num>
 </w:numbering>
 </file>
@@ -13684,6 +13749,7 @@
   <w:style w:type="character" w:default="1" w:styleId="Policepardfaut">
     <w:name w:val="Default Paragraph Font"/>
     <w:uiPriority w:val="1"/>
+    <w:semiHidden/>
     <w:unhideWhenUsed/>
   </w:style>
   <w:style w:type="table" w:default="1" w:styleId="TableauNormal">

</xml_diff>

<commit_message>
ajouter jwt avec cookie
</commit_message>
<xml_diff>
--- a/uploads/Sprint 1.docx
+++ b/uploads/Sprint 1.docx
@@ -351,21 +351,7 @@
               <w:rPr>
                 <w:lang w:val="fr-FR"/>
               </w:rPr>
-              <w:t xml:space="preserve"> </w:t>
-            </w:r>
-            <w:proofErr w:type="gramStart"/>
-            <w:r>
-              <w:rPr>
-                <w:lang w:val="fr-FR"/>
-              </w:rPr>
-              <w:t>vérifier  les</w:t>
-            </w:r>
-            <w:proofErr w:type="gramEnd"/>
-            <w:r>
-              <w:rPr>
-                <w:lang w:val="fr-FR"/>
-              </w:rPr>
-              <w:t xml:space="preserve"> informations saisies</w:t>
+              <w:t xml:space="preserve"> vérifier  les informations saisies</w:t>
             </w:r>
           </w:p>
         </w:tc>
@@ -517,7 +503,6 @@
                 <w:lang w:val="fr-FR"/>
               </w:rPr>
             </w:pPr>
-            <w:proofErr w:type="gramStart"/>
             <w:r>
               <w:rPr>
                 <w:lang w:val="fr-FR"/>
@@ -530,7 +515,6 @@
               </w:rPr>
               <w:t>e utilisateur</w:t>
             </w:r>
-            <w:proofErr w:type="gramEnd"/>
             <w:r>
               <w:rPr>
                 <w:lang w:val="fr-FR"/>
@@ -603,7 +587,6 @@
                 <w:lang w:val="fr-FR"/>
               </w:rPr>
             </w:pPr>
-            <w:proofErr w:type="gramStart"/>
             <w:r>
               <w:rPr>
                 <w:lang w:val="fr-FR"/>
@@ -616,7 +599,6 @@
               </w:rPr>
               <w:t>e utilisateur</w:t>
             </w:r>
-            <w:proofErr w:type="gramEnd"/>
             <w:r>
               <w:rPr>
                 <w:lang w:val="fr-FR"/>
@@ -627,21 +609,7 @@
               <w:rPr>
                 <w:lang w:val="fr-FR"/>
               </w:rPr>
-              <w:t xml:space="preserve"> </w:t>
-            </w:r>
-            <w:proofErr w:type="gramStart"/>
-            <w:r>
-              <w:rPr>
-                <w:lang w:val="fr-FR"/>
-              </w:rPr>
-              <w:t>vérifier  les</w:t>
-            </w:r>
-            <w:proofErr w:type="gramEnd"/>
-            <w:r>
-              <w:rPr>
-                <w:lang w:val="fr-FR"/>
-              </w:rPr>
-              <w:t xml:space="preserve"> informations saisies</w:t>
+              <w:t xml:space="preserve"> vérifier  les informations saisies</w:t>
             </w:r>
           </w:p>
         </w:tc>
@@ -722,7 +690,6 @@
                 <w:lang w:val="fr-FR"/>
               </w:rPr>
             </w:pPr>
-            <w:proofErr w:type="gramStart"/>
             <w:r>
               <w:rPr>
                 <w:lang w:val="fr-FR"/>
@@ -735,7 +702,6 @@
               </w:rPr>
               <w:t>e utilisateur</w:t>
             </w:r>
-            <w:proofErr w:type="gramEnd"/>
             <w:r>
               <w:rPr>
                 <w:lang w:val="fr-FR"/>
@@ -746,21 +712,14 @@
               <w:rPr>
                 <w:lang w:val="fr-FR"/>
               </w:rPr>
+              <w:t xml:space="preserve"> veux </w:t>
+            </w:r>
+            <w:r>
+              <w:rPr>
+                <w:lang w:val="fr-FR"/>
+              </w:rPr>
               <w:t xml:space="preserve"> </w:t>
             </w:r>
-            <w:proofErr w:type="gramStart"/>
-            <w:r>
-              <w:rPr>
-                <w:lang w:val="fr-FR"/>
-              </w:rPr>
-              <w:t xml:space="preserve">veux </w:t>
-            </w:r>
-            <w:r>
-              <w:rPr>
-                <w:lang w:val="fr-FR"/>
-              </w:rPr>
-              <w:t xml:space="preserve"> </w:t>
-            </w:r>
             <w:r>
               <w:rPr>
                 <w:lang w:val="fr-FR"/>
@@ -771,14 +730,7 @@
               <w:rPr>
                 <w:lang w:val="fr-FR"/>
               </w:rPr>
-              <w:t>onsulter</w:t>
-            </w:r>
-            <w:proofErr w:type="gramEnd"/>
-            <w:r>
-              <w:rPr>
-                <w:lang w:val="fr-FR"/>
-              </w:rPr>
-              <w:t xml:space="preserve"> les informations du profil</w:t>
+              <w:t>onsulter les informations du profil</w:t>
             </w:r>
           </w:p>
         </w:tc>
@@ -840,7 +792,6 @@
                 <w:lang w:val="fr-FR"/>
               </w:rPr>
             </w:pPr>
-            <w:proofErr w:type="gramStart"/>
             <w:r>
               <w:rPr>
                 <w:lang w:val="fr-FR"/>
@@ -853,7 +804,6 @@
               </w:rPr>
               <w:t>e utilisateur</w:t>
             </w:r>
-            <w:proofErr w:type="gramEnd"/>
             <w:r>
               <w:rPr>
                 <w:lang w:val="fr-FR"/>
@@ -946,7 +896,6 @@
                 <w:lang w:val="fr-FR"/>
               </w:rPr>
             </w:pPr>
-            <w:proofErr w:type="gramStart"/>
             <w:r>
               <w:rPr>
                 <w:lang w:val="fr-FR"/>
@@ -959,7 +908,6 @@
               </w:rPr>
               <w:t>e utilisateur</w:t>
             </w:r>
-            <w:proofErr w:type="gramEnd"/>
             <w:r>
               <w:rPr>
                 <w:lang w:val="fr-FR"/>
@@ -970,21 +918,14 @@
               <w:rPr>
                 <w:lang w:val="fr-FR"/>
               </w:rPr>
+              <w:t xml:space="preserve"> veux </w:t>
+            </w:r>
+            <w:r>
+              <w:rPr>
+                <w:lang w:val="fr-FR"/>
+              </w:rPr>
               <w:t xml:space="preserve"> </w:t>
             </w:r>
-            <w:proofErr w:type="gramStart"/>
-            <w:r>
-              <w:rPr>
-                <w:lang w:val="fr-FR"/>
-              </w:rPr>
-              <w:t xml:space="preserve">veux </w:t>
-            </w:r>
-            <w:r>
-              <w:rPr>
-                <w:lang w:val="fr-FR"/>
-              </w:rPr>
-              <w:t xml:space="preserve"> </w:t>
-            </w:r>
             <w:r>
               <w:rPr>
                 <w:lang w:val="fr-FR"/>
@@ -995,14 +936,7 @@
               <w:rPr>
                 <w:lang w:val="fr-FR"/>
               </w:rPr>
-              <w:t>nregistrer</w:t>
-            </w:r>
-            <w:proofErr w:type="gramEnd"/>
-            <w:r>
-              <w:rPr>
-                <w:lang w:val="fr-FR"/>
-              </w:rPr>
-              <w:t xml:space="preserve"> les changements</w:t>
+              <w:t>nregistrer les changements</w:t>
             </w:r>
           </w:p>
         </w:tc>
@@ -1066,7 +1000,6 @@
                 <w:lang w:val="fr-FR"/>
               </w:rPr>
             </w:pPr>
-            <w:proofErr w:type="gramStart"/>
             <w:r>
               <w:rPr>
                 <w:lang w:val="fr-FR"/>
@@ -1079,7 +1012,6 @@
               </w:rPr>
               <w:t>e utilisateur</w:t>
             </w:r>
-            <w:proofErr w:type="gramEnd"/>
             <w:r>
               <w:rPr>
                 <w:lang w:val="fr-FR"/>
@@ -1090,21 +1022,14 @@
               <w:rPr>
                 <w:lang w:val="fr-FR"/>
               </w:rPr>
+              <w:t xml:space="preserve"> veux </w:t>
+            </w:r>
+            <w:r>
+              <w:rPr>
+                <w:lang w:val="fr-FR"/>
+              </w:rPr>
               <w:t xml:space="preserve"> </w:t>
             </w:r>
-            <w:proofErr w:type="gramStart"/>
-            <w:r>
-              <w:rPr>
-                <w:lang w:val="fr-FR"/>
-              </w:rPr>
-              <w:t xml:space="preserve">veux </w:t>
-            </w:r>
-            <w:r>
-              <w:rPr>
-                <w:lang w:val="fr-FR"/>
-              </w:rPr>
-              <w:t xml:space="preserve"> </w:t>
-            </w:r>
             <w:r>
               <w:rPr>
                 <w:lang w:val="fr-FR"/>
@@ -1115,14 +1040,7 @@
               <w:rPr>
                 <w:lang w:val="fr-FR"/>
               </w:rPr>
-              <w:t>ecevoir</w:t>
-            </w:r>
-            <w:proofErr w:type="gramEnd"/>
-            <w:r>
-              <w:rPr>
-                <w:lang w:val="fr-FR"/>
-              </w:rPr>
-              <w:t xml:space="preserve"> une confirmation de mise à jour</w:t>
+              <w:t>ecevoir une confirmation de mise à jour</w:t>
             </w:r>
           </w:p>
         </w:tc>
@@ -1208,7 +1126,6 @@
                 <w:lang w:val="fr-FR"/>
               </w:rPr>
             </w:pPr>
-            <w:proofErr w:type="gramStart"/>
             <w:r>
               <w:rPr>
                 <w:lang w:val="fr-FR"/>
@@ -1221,7 +1138,6 @@
               </w:rPr>
               <w:t>e utilisateur</w:t>
             </w:r>
-            <w:proofErr w:type="gramEnd"/>
             <w:r>
               <w:rPr>
                 <w:lang w:val="fr-FR"/>
@@ -1232,21 +1148,14 @@
               <w:rPr>
                 <w:lang w:val="fr-FR"/>
               </w:rPr>
+              <w:t xml:space="preserve"> veux </w:t>
+            </w:r>
+            <w:r>
+              <w:rPr>
+                <w:lang w:val="fr-FR"/>
+              </w:rPr>
               <w:t xml:space="preserve"> </w:t>
             </w:r>
-            <w:proofErr w:type="gramStart"/>
-            <w:r>
-              <w:rPr>
-                <w:lang w:val="fr-FR"/>
-              </w:rPr>
-              <w:t xml:space="preserve">veux </w:t>
-            </w:r>
-            <w:r>
-              <w:rPr>
-                <w:lang w:val="fr-FR"/>
-              </w:rPr>
-              <w:t xml:space="preserve"> </w:t>
-            </w:r>
             <w:r>
               <w:rPr>
                 <w:lang w:val="fr-FR"/>
@@ -1257,14 +1166,7 @@
               <w:rPr>
                 <w:lang w:val="fr-FR"/>
               </w:rPr>
-              <w:t>onsulter</w:t>
-            </w:r>
-            <w:proofErr w:type="gramEnd"/>
-            <w:r>
-              <w:rPr>
-                <w:lang w:val="fr-FR"/>
-              </w:rPr>
-              <w:t xml:space="preserve"> les informations d</w:t>
+              <w:t>onsulter les informations d</w:t>
             </w:r>
             <w:r>
               <w:rPr>
@@ -1332,7 +1234,6 @@
                 <w:lang w:val="fr-FR"/>
               </w:rPr>
             </w:pPr>
-            <w:proofErr w:type="gramStart"/>
             <w:r>
               <w:rPr>
                 <w:lang w:val="fr-FR"/>
@@ -1345,7 +1246,6 @@
               </w:rPr>
               <w:t>e utilisateur</w:t>
             </w:r>
-            <w:proofErr w:type="gramEnd"/>
             <w:r>
               <w:rPr>
                 <w:lang w:val="fr-FR"/>
@@ -1444,7 +1344,6 @@
                 <w:lang w:val="fr-FR"/>
               </w:rPr>
             </w:pPr>
-            <w:proofErr w:type="gramStart"/>
             <w:r>
               <w:rPr>
                 <w:lang w:val="fr-FR"/>
@@ -1457,7 +1356,6 @@
               </w:rPr>
               <w:t>e utilisateur</w:t>
             </w:r>
-            <w:proofErr w:type="gramEnd"/>
             <w:r>
               <w:rPr>
                 <w:lang w:val="fr-FR"/>
@@ -1468,21 +1366,14 @@
               <w:rPr>
                 <w:lang w:val="fr-FR"/>
               </w:rPr>
+              <w:t xml:space="preserve"> veux </w:t>
+            </w:r>
+            <w:r>
+              <w:rPr>
+                <w:lang w:val="fr-FR"/>
+              </w:rPr>
               <w:t xml:space="preserve"> </w:t>
             </w:r>
-            <w:proofErr w:type="gramStart"/>
-            <w:r>
-              <w:rPr>
-                <w:lang w:val="fr-FR"/>
-              </w:rPr>
-              <w:t xml:space="preserve">veux </w:t>
-            </w:r>
-            <w:r>
-              <w:rPr>
-                <w:lang w:val="fr-FR"/>
-              </w:rPr>
-              <w:t xml:space="preserve"> </w:t>
-            </w:r>
             <w:r>
               <w:rPr>
                 <w:lang w:val="fr-FR"/>
@@ -1493,14 +1384,7 @@
               <w:rPr>
                 <w:lang w:val="fr-FR"/>
               </w:rPr>
-              <w:t>nregistrer</w:t>
-            </w:r>
-            <w:proofErr w:type="gramEnd"/>
-            <w:r>
-              <w:rPr>
-                <w:lang w:val="fr-FR"/>
-              </w:rPr>
-              <w:t xml:space="preserve"> les changements</w:t>
+              <w:t>nregistrer les changements</w:t>
             </w:r>
           </w:p>
         </w:tc>
@@ -1564,7 +1448,6 @@
                 <w:lang w:val="fr-FR"/>
               </w:rPr>
             </w:pPr>
-            <w:proofErr w:type="gramStart"/>
             <w:r>
               <w:rPr>
                 <w:lang w:val="fr-FR"/>
@@ -1577,7 +1460,6 @@
               </w:rPr>
               <w:t>e utilisateur</w:t>
             </w:r>
-            <w:proofErr w:type="gramEnd"/>
             <w:r>
               <w:rPr>
                 <w:lang w:val="fr-FR"/>
@@ -1588,21 +1470,14 @@
               <w:rPr>
                 <w:lang w:val="fr-FR"/>
               </w:rPr>
+              <w:t xml:space="preserve"> veux </w:t>
+            </w:r>
+            <w:r>
+              <w:rPr>
+                <w:lang w:val="fr-FR"/>
+              </w:rPr>
               <w:t xml:space="preserve"> </w:t>
             </w:r>
-            <w:proofErr w:type="gramStart"/>
-            <w:r>
-              <w:rPr>
-                <w:lang w:val="fr-FR"/>
-              </w:rPr>
-              <w:t xml:space="preserve">veux </w:t>
-            </w:r>
-            <w:r>
-              <w:rPr>
-                <w:lang w:val="fr-FR"/>
-              </w:rPr>
-              <w:t xml:space="preserve"> </w:t>
-            </w:r>
             <w:r>
               <w:rPr>
                 <w:lang w:val="fr-FR"/>
@@ -1613,14 +1488,7 @@
               <w:rPr>
                 <w:lang w:val="fr-FR"/>
               </w:rPr>
-              <w:t>ecevoir</w:t>
-            </w:r>
-            <w:proofErr w:type="gramEnd"/>
-            <w:r>
-              <w:rPr>
-                <w:lang w:val="fr-FR"/>
-              </w:rPr>
-              <w:t xml:space="preserve"> une confirmation de mise à jour</w:t>
+              <w:t>ecevoir une confirmation de mise à jour</w:t>
             </w:r>
           </w:p>
         </w:tc>
@@ -1689,14 +1557,7 @@
               <w:rPr>
                 <w:lang w:val="fr-FR"/>
               </w:rPr>
-              <w:t xml:space="preserve">En tant </w:t>
-            </w:r>
-            <w:proofErr w:type="gramStart"/>
-            <w:r>
-              <w:rPr>
-                <w:lang w:val="fr-FR"/>
-              </w:rPr>
-              <w:t>qu’</w:t>
+              <w:t>En tant qu’</w:t>
             </w:r>
             <w:proofErr w:type="spellStart"/>
             <w:r>
@@ -1706,7 +1567,6 @@
               <w:t>Administrateur,je</w:t>
             </w:r>
             <w:proofErr w:type="spellEnd"/>
-            <w:proofErr w:type="gramEnd"/>
             <w:r>
               <w:rPr>
                 <w:lang w:val="fr-FR"/>
@@ -1755,14 +1615,7 @@
               <w:rPr>
                 <w:lang w:val="fr-FR"/>
               </w:rPr>
-              <w:t xml:space="preserve">En tant </w:t>
-            </w:r>
-            <w:proofErr w:type="gramStart"/>
-            <w:r>
-              <w:rPr>
-                <w:lang w:val="fr-FR"/>
-              </w:rPr>
-              <w:t>qu’</w:t>
+              <w:t>En tant qu’</w:t>
             </w:r>
             <w:proofErr w:type="spellStart"/>
             <w:r>
@@ -1772,7 +1625,6 @@
               <w:t>Administrateur,je</w:t>
             </w:r>
             <w:proofErr w:type="spellEnd"/>
-            <w:proofErr w:type="gramEnd"/>
             <w:r>
               <w:rPr>
                 <w:lang w:val="fr-FR"/>
@@ -1863,14 +1715,7 @@
               <w:rPr>
                 <w:lang w:val="fr-FR"/>
               </w:rPr>
-              <w:t xml:space="preserve">En tant </w:t>
-            </w:r>
-            <w:proofErr w:type="gramStart"/>
-            <w:r>
-              <w:rPr>
-                <w:lang w:val="fr-FR"/>
-              </w:rPr>
-              <w:t>qu’</w:t>
+              <w:t>En tant qu’</w:t>
             </w:r>
             <w:proofErr w:type="spellStart"/>
             <w:r>
@@ -1880,7 +1725,6 @@
               <w:t>Administrateur,je</w:t>
             </w:r>
             <w:proofErr w:type="spellEnd"/>
-            <w:proofErr w:type="gramEnd"/>
             <w:r>
               <w:rPr>
                 <w:lang w:val="fr-FR"/>
@@ -1965,14 +1809,7 @@
               <w:rPr>
                 <w:lang w:val="fr-FR"/>
               </w:rPr>
-              <w:t xml:space="preserve">En tant </w:t>
-            </w:r>
-            <w:proofErr w:type="gramStart"/>
-            <w:r>
-              <w:rPr>
-                <w:lang w:val="fr-FR"/>
-              </w:rPr>
-              <w:t>qu’</w:t>
+              <w:t>En tant qu’</w:t>
             </w:r>
             <w:proofErr w:type="spellStart"/>
             <w:r>
@@ -1982,7 +1819,6 @@
               <w:t>Administrateur,je</w:t>
             </w:r>
             <w:proofErr w:type="spellEnd"/>
-            <w:proofErr w:type="gramEnd"/>
             <w:r>
               <w:rPr>
                 <w:lang w:val="fr-FR"/>
@@ -2104,23 +1940,22 @@
         <w:rPr>
           <w:b/>
           <w:bCs/>
-          <w:noProof/>
           <w:sz w:val="28"/>
           <w:szCs w:val="28"/>
         </w:rPr>
         <w:drawing>
-          <wp:anchor distT="0" distB="0" distL="114300" distR="114300" simplePos="0" relativeHeight="251667456" behindDoc="0" locked="0" layoutInCell="1" allowOverlap="1" wp14:anchorId="192A3C67" wp14:editId="4DE5EEC3">
+          <wp:anchor distT="0" distB="0" distL="114300" distR="114300" simplePos="0" relativeHeight="251670528" behindDoc="0" locked="0" layoutInCell="1" allowOverlap="1" wp14:anchorId="2E10A30C" wp14:editId="51F0C3A5">
             <wp:simplePos x="0" y="0"/>
             <wp:positionH relativeFrom="column">
-              <wp:posOffset>-259080</wp:posOffset>
+              <wp:posOffset>-68580</wp:posOffset>
             </wp:positionH>
             <wp:positionV relativeFrom="page">
-              <wp:posOffset>7239000</wp:posOffset>
+              <wp:posOffset>6454140</wp:posOffset>
             </wp:positionV>
-            <wp:extent cx="6553200" cy="2712720"/>
+            <wp:extent cx="5943600" cy="3131820"/>
             <wp:effectExtent l="0" t="0" r="0" b="0"/>
             <wp:wrapSquare wrapText="bothSides"/>
-            <wp:docPr id="43753841" name="Image 2"/>
+            <wp:docPr id="1479546990" name="Picture 2"/>
             <wp:cNvGraphicFramePr>
               <a:graphicFrameLocks xmlns:a="http://schemas.openxmlformats.org/drawingml/2006/main" noChangeAspect="1"/>
             </wp:cNvGraphicFramePr>
@@ -2149,7 +1984,7 @@
                   <pic:spPr bwMode="auto">
                     <a:xfrm>
                       <a:off x="0" y="0"/>
-                      <a:ext cx="6553200" cy="2712720"/>
+                      <a:ext cx="5943600" cy="3131820"/>
                     </a:xfrm>
                     <a:prstGeom prst="rect">
                       <a:avLst/>
@@ -2162,9 +1997,6 @@
                 </pic:pic>
               </a:graphicData>
             </a:graphic>
-            <wp14:sizeRelH relativeFrom="margin">
-              <wp14:pctWidth>0</wp14:pctWidth>
-            </wp14:sizeRelH>
             <wp14:sizeRelV relativeFrom="margin">
               <wp14:pctHeight>0</wp14:pctHeight>
             </wp14:sizeRelV>
@@ -2211,6 +2043,7 @@
           <w:szCs w:val="28"/>
           <w:lang w:val="fr-FR"/>
         </w:rPr>
+        <w:lastRenderedPageBreak/>
         <w:t>2/</w:t>
       </w:r>
       <w:r>
@@ -2298,7 +2131,7 @@
     </w:p>
     <w:tbl>
       <w:tblPr>
-        <w:tblStyle w:val="Grilledutableau"/>
+        <w:tblStyle w:val="TableGrid"/>
         <w:tblW w:w="11482" w:type="dxa"/>
         <w:tblInd w:w="-1281" w:type="dxa"/>
         <w:tblLook w:val="04A0" w:firstRow="1" w:lastRow="0" w:firstColumn="1" w:lastColumn="0" w:noHBand="0" w:noVBand="1"/>
@@ -2326,7 +2159,6 @@
                 <w:szCs w:val="28"/>
                 <w:lang w:val="fr-FR"/>
               </w:rPr>
-              <w:lastRenderedPageBreak/>
               <w:t>Titre CU </w:t>
             </w:r>
           </w:p>
@@ -2394,23 +2226,7 @@
                 <w:sz w:val="28"/>
                 <w:szCs w:val="28"/>
               </w:rPr>
-              <w:t xml:space="preserve">Acteur </w:t>
-            </w:r>
-            <w:proofErr w:type="gramStart"/>
-            <w:r>
-              <w:rPr>
-                <w:sz w:val="28"/>
-                <w:szCs w:val="28"/>
-              </w:rPr>
-              <w:t>principal :</w:t>
-            </w:r>
-            <w:proofErr w:type="gramEnd"/>
-            <w:r>
-              <w:rPr>
-                <w:sz w:val="28"/>
-                <w:szCs w:val="28"/>
-              </w:rPr>
-              <w:t xml:space="preserve"> </w:t>
+              <w:t xml:space="preserve">Acteur principal : </w:t>
             </w:r>
             <w:proofErr w:type="spellStart"/>
             <w:r>
@@ -2655,25 +2471,7 @@
                 <w:szCs w:val="28"/>
                 <w:lang w:val="fr-FR"/>
               </w:rPr>
-              <w:t xml:space="preserve">2.L’Administrateur sélectionne l’option « Consulter les </w:t>
-            </w:r>
-            <w:proofErr w:type="gramStart"/>
-            <w:r>
-              <w:rPr>
-                <w:sz w:val="28"/>
-                <w:szCs w:val="28"/>
-                <w:lang w:val="fr-FR"/>
-              </w:rPr>
-              <w:t>demandes»</w:t>
-            </w:r>
-            <w:proofErr w:type="gramEnd"/>
-            <w:r>
-              <w:rPr>
-                <w:sz w:val="28"/>
-                <w:szCs w:val="28"/>
-                <w:lang w:val="fr-FR"/>
-              </w:rPr>
-              <w:t>.</w:t>
+              <w:t>2.L’Administrateur sélectionne l’option « Consulter les demandes».</w:t>
             </w:r>
           </w:p>
           <w:p>
@@ -2713,7 +2511,7 @@
           </w:p>
           <w:p>
             <w:pPr>
-              <w:pStyle w:val="Paragraphedeliste"/>
+              <w:pStyle w:val="ListParagraph"/>
               <w:numPr>
                 <w:ilvl w:val="2"/>
                 <w:numId w:val="11"/>
@@ -2724,28 +2522,18 @@
                 <w:lang w:val="fr-FR"/>
               </w:rPr>
             </w:pPr>
-            <w:proofErr w:type="gramStart"/>
-            <w:r>
-              <w:rPr>
-                <w:sz w:val="28"/>
-                <w:szCs w:val="28"/>
-                <w:lang w:val="fr-FR"/>
-              </w:rPr>
-              <w:t>nom</w:t>
-            </w:r>
-            <w:proofErr w:type="gramEnd"/>
-            <w:r>
-              <w:rPr>
-                <w:sz w:val="28"/>
-                <w:szCs w:val="28"/>
-                <w:lang w:val="fr-FR"/>
-              </w:rPr>
-              <w:t xml:space="preserve"> et prénom de demandeur,</w:t>
-            </w:r>
-          </w:p>
-          <w:p>
-            <w:pPr>
-              <w:pStyle w:val="Paragraphedeliste"/>
+            <w:r>
+              <w:rPr>
+                <w:sz w:val="28"/>
+                <w:szCs w:val="28"/>
+                <w:lang w:val="fr-FR"/>
+              </w:rPr>
+              <w:t>nom et prénom de demandeur,</w:t>
+            </w:r>
+          </w:p>
+          <w:p>
+            <w:pPr>
+              <w:pStyle w:val="ListParagraph"/>
               <w:numPr>
                 <w:ilvl w:val="2"/>
                 <w:numId w:val="11"/>
@@ -2756,28 +2544,18 @@
                 <w:lang w:val="fr-FR"/>
               </w:rPr>
             </w:pPr>
-            <w:proofErr w:type="gramStart"/>
-            <w:r>
-              <w:rPr>
-                <w:sz w:val="28"/>
-                <w:szCs w:val="28"/>
-                <w:lang w:val="fr-FR"/>
-              </w:rPr>
-              <w:t>email</w:t>
-            </w:r>
-            <w:proofErr w:type="gramEnd"/>
-            <w:r>
-              <w:rPr>
-                <w:sz w:val="28"/>
-                <w:szCs w:val="28"/>
-                <w:lang w:val="fr-FR"/>
-              </w:rPr>
-              <w:t xml:space="preserve"> demandeur,</w:t>
-            </w:r>
-          </w:p>
-          <w:p>
-            <w:pPr>
-              <w:pStyle w:val="Paragraphedeliste"/>
+            <w:r>
+              <w:rPr>
+                <w:sz w:val="28"/>
+                <w:szCs w:val="28"/>
+                <w:lang w:val="fr-FR"/>
+              </w:rPr>
+              <w:t>email demandeur,</w:t>
+            </w:r>
+          </w:p>
+          <w:p>
+            <w:pPr>
+              <w:pStyle w:val="ListParagraph"/>
               <w:numPr>
                 <w:ilvl w:val="2"/>
                 <w:numId w:val="11"/>
@@ -2788,28 +2566,18 @@
                 <w:lang w:val="fr-FR"/>
               </w:rPr>
             </w:pPr>
-            <w:proofErr w:type="gramStart"/>
-            <w:r>
-              <w:rPr>
-                <w:sz w:val="28"/>
-                <w:szCs w:val="28"/>
-                <w:lang w:val="fr-FR"/>
-              </w:rPr>
-              <w:t>nom</w:t>
-            </w:r>
-            <w:proofErr w:type="gramEnd"/>
-            <w:r>
-              <w:rPr>
-                <w:sz w:val="28"/>
-                <w:szCs w:val="28"/>
-                <w:lang w:val="fr-FR"/>
-              </w:rPr>
-              <w:t xml:space="preserve"> de l’organisme,</w:t>
-            </w:r>
-          </w:p>
-          <w:p>
-            <w:pPr>
-              <w:pStyle w:val="Paragraphedeliste"/>
+            <w:r>
+              <w:rPr>
+                <w:sz w:val="28"/>
+                <w:szCs w:val="28"/>
+                <w:lang w:val="fr-FR"/>
+              </w:rPr>
+              <w:t>nom de l’organisme,</w:t>
+            </w:r>
+          </w:p>
+          <w:p>
+            <w:pPr>
+              <w:pStyle w:val="ListParagraph"/>
               <w:numPr>
                 <w:ilvl w:val="2"/>
                 <w:numId w:val="11"/>
@@ -2821,7 +2589,6 @@
               </w:rPr>
             </w:pPr>
             <w:proofErr w:type="spellStart"/>
-            <w:proofErr w:type="gramStart"/>
             <w:r>
               <w:rPr>
                 <w:sz w:val="28"/>
@@ -2831,7 +2598,6 @@
               <w:t>role</w:t>
             </w:r>
             <w:proofErr w:type="spellEnd"/>
-            <w:proofErr w:type="gramEnd"/>
             <w:r>
               <w:rPr>
                 <w:sz w:val="28"/>
@@ -2861,7 +2627,7 @@
           </w:p>
           <w:p>
             <w:pPr>
-              <w:pStyle w:val="Paragraphedeliste"/>
+              <w:pStyle w:val="ListParagraph"/>
               <w:numPr>
                 <w:ilvl w:val="2"/>
                 <w:numId w:val="11"/>
@@ -2872,28 +2638,18 @@
                 <w:lang w:val="fr-FR"/>
               </w:rPr>
             </w:pPr>
-            <w:proofErr w:type="gramStart"/>
-            <w:r>
-              <w:rPr>
-                <w:sz w:val="28"/>
-                <w:szCs w:val="28"/>
-                <w:lang w:val="fr-FR"/>
-              </w:rPr>
-              <w:t>date</w:t>
-            </w:r>
-            <w:proofErr w:type="gramEnd"/>
-            <w:r>
-              <w:rPr>
-                <w:sz w:val="28"/>
-                <w:szCs w:val="28"/>
-                <w:lang w:val="fr-FR"/>
-              </w:rPr>
-              <w:t xml:space="preserve"> de soumission,</w:t>
-            </w:r>
-          </w:p>
-          <w:p>
-            <w:pPr>
-              <w:pStyle w:val="Paragraphedeliste"/>
+            <w:r>
+              <w:rPr>
+                <w:sz w:val="28"/>
+                <w:szCs w:val="28"/>
+                <w:lang w:val="fr-FR"/>
+              </w:rPr>
+              <w:t>date de soumission,</w:t>
+            </w:r>
+          </w:p>
+          <w:p>
+            <w:pPr>
+              <w:pStyle w:val="ListParagraph"/>
               <w:numPr>
                 <w:ilvl w:val="2"/>
                 <w:numId w:val="11"/>
@@ -2904,42 +2660,22 @@
                 <w:lang w:val="fr-FR"/>
               </w:rPr>
             </w:pPr>
-            <w:proofErr w:type="gramStart"/>
-            <w:r>
-              <w:rPr>
-                <w:sz w:val="28"/>
-                <w:szCs w:val="28"/>
-                <w:lang w:val="fr-FR"/>
-              </w:rPr>
-              <w:t>statut(</w:t>
-            </w:r>
-            <w:proofErr w:type="gramEnd"/>
-            <w:r>
-              <w:rPr>
-                <w:sz w:val="28"/>
-                <w:szCs w:val="28"/>
-                <w:lang w:val="fr-FR"/>
-              </w:rPr>
-              <w:t xml:space="preserve">en </w:t>
+            <w:r>
+              <w:rPr>
+                <w:sz w:val="28"/>
+                <w:szCs w:val="28"/>
+                <w:lang w:val="fr-FR"/>
+              </w:rPr>
+              <w:t xml:space="preserve">statut(en </w:t>
             </w:r>
             <w:proofErr w:type="spellStart"/>
-            <w:proofErr w:type="gramStart"/>
-            <w:r>
-              <w:rPr>
-                <w:sz w:val="28"/>
-                <w:szCs w:val="28"/>
-                <w:lang w:val="fr-FR"/>
-              </w:rPr>
-              <w:t>attente,validé</w:t>
-            </w:r>
-            <w:proofErr w:type="gramEnd"/>
-            <w:r>
-              <w:rPr>
-                <w:sz w:val="28"/>
-                <w:szCs w:val="28"/>
-                <w:lang w:val="fr-FR"/>
-              </w:rPr>
-              <w:t>,rejetté</w:t>
+            <w:r>
+              <w:rPr>
+                <w:sz w:val="28"/>
+                <w:szCs w:val="28"/>
+                <w:lang w:val="fr-FR"/>
+              </w:rPr>
+              <w:t>attente,validé,rejetté</w:t>
             </w:r>
             <w:proofErr w:type="spellEnd"/>
             <w:r>
@@ -2988,7 +2724,6 @@
                 <w:lang w:val="fr-FR"/>
               </w:rPr>
             </w:pPr>
-            <w:proofErr w:type="gramStart"/>
             <w:r>
               <w:rPr>
                 <w:sz w:val="28"/>
@@ -3003,16 +2738,7 @@
                 <w:szCs w:val="28"/>
                 <w:lang w:val="fr-FR"/>
               </w:rPr>
-              <w:t>Aucune</w:t>
-            </w:r>
-            <w:proofErr w:type="gramEnd"/>
-            <w:r>
-              <w:rPr>
-                <w:sz w:val="28"/>
-                <w:szCs w:val="28"/>
-                <w:lang w:val="fr-FR"/>
-              </w:rPr>
-              <w:t xml:space="preserve"> demande enregistrée</w:t>
+              <w:t>Aucune demande enregistrée</w:t>
             </w:r>
           </w:p>
           <w:p>
@@ -3094,7 +2820,7 @@
     </w:p>
     <w:tbl>
       <w:tblPr>
-        <w:tblStyle w:val="Grilledutableau"/>
+        <w:tblStyle w:val="TableGrid"/>
         <w:tblW w:w="11482" w:type="dxa"/>
         <w:tblInd w:w="-1281" w:type="dxa"/>
         <w:tblLook w:val="04A0" w:firstRow="1" w:lastRow="0" w:firstColumn="1" w:lastColumn="0" w:noHBand="0" w:noVBand="1"/>
@@ -3185,7 +2911,6 @@
                 <w:lang w:val="fr-FR"/>
               </w:rPr>
             </w:pPr>
-            <w:proofErr w:type="gramStart"/>
             <w:r>
               <w:rPr>
                 <w:sz w:val="28"/>
@@ -3202,7 +2927,6 @@
               </w:rPr>
               <w:t>tilisateur</w:t>
             </w:r>
-            <w:proofErr w:type="gramEnd"/>
             <w:r>
               <w:rPr>
                 <w:sz w:val="28"/>
@@ -3353,6 +3077,7 @@
                 <w:sz w:val="28"/>
                 <w:szCs w:val="28"/>
               </w:rPr>
+              <w:lastRenderedPageBreak/>
               <w:t>Post-conditions</w:t>
             </w:r>
           </w:p>
@@ -3421,7 +3146,6 @@
                 <w:sz w:val="28"/>
                 <w:szCs w:val="28"/>
               </w:rPr>
-              <w:lastRenderedPageBreak/>
               <w:t>Sc</w:t>
             </w:r>
             <w:r>
@@ -3618,16 +3342,7 @@
                 <w:szCs w:val="28"/>
                 <w:lang w:val="fr-FR"/>
               </w:rPr>
-              <w:t xml:space="preserve">L’utilisateur remplit le formulaire avec ses </w:t>
-            </w:r>
-            <w:proofErr w:type="gramStart"/>
-            <w:r>
-              <w:rPr>
-                <w:sz w:val="28"/>
-                <w:szCs w:val="28"/>
-                <w:lang w:val="fr-FR"/>
-              </w:rPr>
-              <w:t>informations(</w:t>
+              <w:t>L’utilisateur remplit le formulaire avec ses informations(</w:t>
             </w:r>
             <w:proofErr w:type="spellStart"/>
             <w:r>
@@ -3636,34 +3351,7 @@
                 <w:szCs w:val="28"/>
                 <w:lang w:val="fr-FR"/>
               </w:rPr>
-              <w:t>nom,prénom</w:t>
-            </w:r>
-            <w:proofErr w:type="gramEnd"/>
-            <w:r>
-              <w:rPr>
-                <w:sz w:val="28"/>
-                <w:szCs w:val="28"/>
-                <w:lang w:val="fr-FR"/>
-              </w:rPr>
-              <w:t>,</w:t>
-            </w:r>
-            <w:proofErr w:type="gramStart"/>
-            <w:r>
-              <w:rPr>
-                <w:sz w:val="28"/>
-                <w:szCs w:val="28"/>
-                <w:lang w:val="fr-FR"/>
-              </w:rPr>
-              <w:t>email,organisme</w:t>
-            </w:r>
-            <w:proofErr w:type="gramEnd"/>
-            <w:r>
-              <w:rPr>
-                <w:sz w:val="28"/>
-                <w:szCs w:val="28"/>
-                <w:lang w:val="fr-FR"/>
-              </w:rPr>
-              <w:t>,role</w:t>
+              <w:t>nom,prénom,email,organisme,role</w:t>
             </w:r>
             <w:proofErr w:type="spellEnd"/>
             <w:r>
@@ -3698,19 +3386,9 @@
                 <w:szCs w:val="28"/>
                 <w:lang w:val="fr-FR"/>
               </w:rPr>
-              <w:t xml:space="preserve">’utilisateur valide le </w:t>
-            </w:r>
-            <w:proofErr w:type="gramStart"/>
-            <w:r>
-              <w:rPr>
-                <w:sz w:val="28"/>
-                <w:szCs w:val="28"/>
-                <w:lang w:val="fr-FR"/>
-              </w:rPr>
-              <w:t>formulaire(</w:t>
+              <w:t>’utilisateur valide le formulaire(</w:t>
             </w:r>
             <w:proofErr w:type="spellStart"/>
-            <w:proofErr w:type="gramEnd"/>
             <w:r>
               <w:rPr>
                 <w:sz w:val="28"/>
@@ -4010,7 +3688,7 @@
           </w:p>
           <w:p>
             <w:pPr>
-              <w:pStyle w:val="Paragraphedeliste"/>
+              <w:pStyle w:val="ListParagraph"/>
               <w:numPr>
                 <w:ilvl w:val="0"/>
                 <w:numId w:val="17"/>
@@ -4021,23 +3699,13 @@
                 <w:lang w:val="fr-FR"/>
               </w:rPr>
             </w:pPr>
-            <w:proofErr w:type="gramStart"/>
-            <w:r>
-              <w:rPr>
-                <w:sz w:val="28"/>
-                <w:szCs w:val="28"/>
-                <w:lang w:val="fr-FR"/>
-              </w:rPr>
-              <w:t>système</w:t>
-            </w:r>
-            <w:proofErr w:type="gramEnd"/>
-            <w:r>
-              <w:rPr>
-                <w:sz w:val="28"/>
-                <w:szCs w:val="28"/>
-                <w:lang w:val="fr-FR"/>
-              </w:rPr>
-              <w:t xml:space="preserve"> affiche un message d’erreur</w:t>
+            <w:r>
+              <w:rPr>
+                <w:sz w:val="28"/>
+                <w:szCs w:val="28"/>
+                <w:lang w:val="fr-FR"/>
+              </w:rPr>
+              <w:t>système affiche un message d’erreur</w:t>
             </w:r>
           </w:p>
           <w:p>
@@ -4049,28 +3717,18 @@
                 <w:lang w:val="fr-FR"/>
               </w:rPr>
             </w:pPr>
-            <w:proofErr w:type="gramStart"/>
-            <w:r>
-              <w:rPr>
-                <w:sz w:val="28"/>
-                <w:szCs w:val="28"/>
-                <w:lang w:val="fr-FR"/>
-              </w:rPr>
-              <w:t>5.2)Email</w:t>
-            </w:r>
-            <w:proofErr w:type="gramEnd"/>
-            <w:r>
-              <w:rPr>
-                <w:sz w:val="28"/>
-                <w:szCs w:val="28"/>
-                <w:lang w:val="fr-FR"/>
-              </w:rPr>
-              <w:t xml:space="preserve"> existe déjà :</w:t>
-            </w:r>
-          </w:p>
-          <w:p>
-            <w:pPr>
-              <w:pStyle w:val="Paragraphedeliste"/>
+            <w:r>
+              <w:rPr>
+                <w:sz w:val="28"/>
+                <w:szCs w:val="28"/>
+                <w:lang w:val="fr-FR"/>
+              </w:rPr>
+              <w:t>5.2)Email existe déjà :</w:t>
+            </w:r>
+          </w:p>
+          <w:p>
+            <w:pPr>
+              <w:pStyle w:val="ListParagraph"/>
               <w:numPr>
                 <w:ilvl w:val="0"/>
                 <w:numId w:val="17"/>
@@ -4082,7 +3740,6 @@
               </w:rPr>
             </w:pPr>
             <w:proofErr w:type="spellStart"/>
-            <w:proofErr w:type="gramStart"/>
             <w:r>
               <w:rPr>
                 <w:sz w:val="28"/>
@@ -4100,32 +3757,13 @@
               <w:t>éme</w:t>
             </w:r>
             <w:proofErr w:type="spellEnd"/>
-            <w:proofErr w:type="gramEnd"/>
-            <w:r>
-              <w:rPr>
-                <w:sz w:val="28"/>
-                <w:szCs w:val="28"/>
-                <w:lang w:val="fr-FR"/>
-              </w:rPr>
-              <w:t xml:space="preserve"> affiche un </w:t>
-            </w:r>
-            <w:proofErr w:type="gramStart"/>
-            <w:r>
-              <w:rPr>
-                <w:sz w:val="28"/>
-                <w:szCs w:val="28"/>
-                <w:lang w:val="fr-FR"/>
-              </w:rPr>
-              <w:t>alerte  «</w:t>
-            </w:r>
-            <w:proofErr w:type="gramEnd"/>
-            <w:r>
-              <w:rPr>
-                <w:sz w:val="28"/>
-                <w:szCs w:val="28"/>
-                <w:lang w:val="fr-FR"/>
-              </w:rPr>
-              <w:t> email existe déjà »</w:t>
+            <w:r>
+              <w:rPr>
+                <w:sz w:val="28"/>
+                <w:szCs w:val="28"/>
+                <w:lang w:val="fr-FR"/>
+              </w:rPr>
+              <w:t xml:space="preserve"> affiche un alerte  « email existe déjà »</w:t>
             </w:r>
           </w:p>
         </w:tc>
@@ -4167,7 +3805,7 @@
     </w:p>
     <w:tbl>
       <w:tblPr>
-        <w:tblStyle w:val="Grilledutableau"/>
+        <w:tblStyle w:val="TableGrid"/>
         <w:tblW w:w="11482" w:type="dxa"/>
         <w:tblInd w:w="-1281" w:type="dxa"/>
         <w:tblLook w:val="04A0" w:firstRow="1" w:lastRow="0" w:firstColumn="1" w:lastColumn="0" w:noHBand="0" w:noVBand="1"/>
@@ -4276,7 +3914,6 @@
                 <w:lang w:val="fr-FR"/>
               </w:rPr>
             </w:pPr>
-            <w:proofErr w:type="gramStart"/>
             <w:r>
               <w:rPr>
                 <w:sz w:val="28"/>
@@ -4291,43 +3928,24 @@
                 <w:szCs w:val="28"/>
                 <w:lang w:val="fr-FR"/>
               </w:rPr>
-              <w:t>tilisateur</w:t>
-            </w:r>
-            <w:proofErr w:type="gramEnd"/>
-            <w:r>
-              <w:rPr>
-                <w:sz w:val="28"/>
-                <w:szCs w:val="28"/>
-                <w:lang w:val="fr-FR"/>
-              </w:rPr>
-              <w:t>(responsable/évaluateur)</w:t>
-            </w:r>
-          </w:p>
-          <w:p>
-            <w:pPr>
-              <w:rPr>
-                <w:sz w:val="28"/>
-                <w:szCs w:val="28"/>
-                <w:lang w:val="fr-FR"/>
-              </w:rPr>
-            </w:pPr>
-            <w:proofErr w:type="gramStart"/>
-            <w:r>
-              <w:rPr>
-                <w:sz w:val="28"/>
-                <w:szCs w:val="28"/>
-                <w:lang w:val="fr-FR"/>
-              </w:rPr>
-              <w:t>administrateur</w:t>
-            </w:r>
-            <w:proofErr w:type="gramEnd"/>
-            <w:r>
-              <w:rPr>
-                <w:sz w:val="28"/>
-                <w:szCs w:val="28"/>
-                <w:lang w:val="fr-FR"/>
-              </w:rPr>
-              <w:t xml:space="preserve"> </w:t>
+              <w:t>tilisateur(responsable/évaluateur)</w:t>
+            </w:r>
+          </w:p>
+          <w:p>
+            <w:pPr>
+              <w:rPr>
+                <w:sz w:val="28"/>
+                <w:szCs w:val="28"/>
+                <w:lang w:val="fr-FR"/>
+              </w:rPr>
+            </w:pPr>
+            <w:r>
+              <w:rPr>
+                <w:sz w:val="28"/>
+                <w:szCs w:val="28"/>
+                <w:lang w:val="fr-FR"/>
+              </w:rPr>
+              <w:t xml:space="preserve">administrateur </w:t>
             </w:r>
             <w:proofErr w:type="spellStart"/>
             <w:r>
@@ -4684,7 +4302,6 @@
               <w:t xml:space="preserve"> saisit ses informations(</w:t>
             </w:r>
             <w:proofErr w:type="spellStart"/>
-            <w:proofErr w:type="gramStart"/>
             <w:r>
               <w:rPr>
                 <w:sz w:val="28"/>
@@ -4694,7 +4311,6 @@
               <w:t>email,password</w:t>
             </w:r>
             <w:proofErr w:type="spellEnd"/>
-            <w:proofErr w:type="gramEnd"/>
             <w:r>
               <w:rPr>
                 <w:sz w:val="28"/>
@@ -4763,25 +4379,7 @@
                 <w:szCs w:val="28"/>
                 <w:lang w:val="fr-FR"/>
               </w:rPr>
-              <w:t xml:space="preserve"> </w:t>
-            </w:r>
-            <w:proofErr w:type="gramStart"/>
-            <w:r>
-              <w:rPr>
-                <w:sz w:val="28"/>
-                <w:szCs w:val="28"/>
-                <w:lang w:val="fr-FR"/>
-              </w:rPr>
-              <w:t>« ce</w:t>
-            </w:r>
-            <w:proofErr w:type="gramEnd"/>
-            <w:r>
-              <w:rPr>
-                <w:sz w:val="28"/>
-                <w:szCs w:val="28"/>
-                <w:lang w:val="fr-FR"/>
-              </w:rPr>
-              <w:t xml:space="preserve"> connecter »</w:t>
+              <w:t xml:space="preserve"> « ce connecter »</w:t>
             </w:r>
           </w:p>
           <w:p>
@@ -4934,6 +4532,7 @@
                 <w:szCs w:val="28"/>
                 <w:lang w:val="fr-FR"/>
               </w:rPr>
+              <w:lastRenderedPageBreak/>
               <w:t>Scénarios Alternatifs</w:t>
             </w:r>
           </w:p>
@@ -5017,7 +4616,7 @@
           </w:p>
           <w:p>
             <w:pPr>
-              <w:pStyle w:val="Paragraphedeliste"/>
+              <w:pStyle w:val="ListParagraph"/>
               <w:numPr>
                 <w:ilvl w:val="0"/>
                 <w:numId w:val="17"/>
@@ -5028,23 +4627,13 @@
                 <w:lang w:val="fr-FR"/>
               </w:rPr>
             </w:pPr>
-            <w:proofErr w:type="gramStart"/>
-            <w:r>
-              <w:rPr>
-                <w:sz w:val="28"/>
-                <w:szCs w:val="28"/>
-                <w:lang w:val="fr-FR"/>
-              </w:rPr>
-              <w:t>système</w:t>
-            </w:r>
-            <w:proofErr w:type="gramEnd"/>
-            <w:r>
-              <w:rPr>
-                <w:sz w:val="28"/>
-                <w:szCs w:val="28"/>
-                <w:lang w:val="fr-FR"/>
-              </w:rPr>
-              <w:t xml:space="preserve"> affiche un message d’erreur</w:t>
+            <w:r>
+              <w:rPr>
+                <w:sz w:val="28"/>
+                <w:szCs w:val="28"/>
+                <w:lang w:val="fr-FR"/>
+              </w:rPr>
+              <w:t>système affiche un message d’erreur</w:t>
             </w:r>
           </w:p>
           <w:p>
@@ -5056,7 +4645,6 @@
                 <w:lang w:val="fr-FR"/>
               </w:rPr>
             </w:pPr>
-            <w:proofErr w:type="gramStart"/>
             <w:r>
               <w:rPr>
                 <w:sz w:val="28"/>
@@ -5071,16 +4659,7 @@
                 <w:szCs w:val="28"/>
                 <w:lang w:val="fr-FR"/>
               </w:rPr>
-              <w:t>.2)Email</w:t>
-            </w:r>
-            <w:proofErr w:type="gramEnd"/>
-            <w:r>
-              <w:rPr>
-                <w:sz w:val="28"/>
-                <w:szCs w:val="28"/>
-                <w:lang w:val="fr-FR"/>
-              </w:rPr>
-              <w:t xml:space="preserve"> </w:t>
+              <w:t xml:space="preserve">.2)Email </w:t>
             </w:r>
             <w:r>
               <w:rPr>
@@ -5117,7 +4696,7 @@
           </w:p>
           <w:p>
             <w:pPr>
-              <w:pStyle w:val="Paragraphedeliste"/>
+              <w:pStyle w:val="ListParagraph"/>
               <w:numPr>
                 <w:ilvl w:val="0"/>
                 <w:numId w:val="17"/>
@@ -5129,7 +4708,6 @@
               </w:rPr>
             </w:pPr>
             <w:proofErr w:type="spellStart"/>
-            <w:proofErr w:type="gramStart"/>
             <w:r>
               <w:rPr>
                 <w:sz w:val="28"/>
@@ -5147,32 +4725,13 @@
               <w:t>éme</w:t>
             </w:r>
             <w:proofErr w:type="spellEnd"/>
-            <w:proofErr w:type="gramEnd"/>
-            <w:r>
-              <w:rPr>
-                <w:sz w:val="28"/>
-                <w:szCs w:val="28"/>
-                <w:lang w:val="fr-FR"/>
-              </w:rPr>
-              <w:t xml:space="preserve"> affiche un </w:t>
-            </w:r>
-            <w:proofErr w:type="gramStart"/>
-            <w:r>
-              <w:rPr>
-                <w:sz w:val="28"/>
-                <w:szCs w:val="28"/>
-                <w:lang w:val="fr-FR"/>
-              </w:rPr>
-              <w:t>alerte  «</w:t>
-            </w:r>
-            <w:proofErr w:type="gramEnd"/>
-            <w:r>
-              <w:rPr>
-                <w:sz w:val="28"/>
-                <w:szCs w:val="28"/>
-                <w:lang w:val="fr-FR"/>
-              </w:rPr>
-              <w:t xml:space="preserve"> email </w:t>
+            <w:r>
+              <w:rPr>
+                <w:sz w:val="28"/>
+                <w:szCs w:val="28"/>
+                <w:lang w:val="fr-FR"/>
+              </w:rPr>
+              <w:t xml:space="preserve"> affiche un alerte  « email </w:t>
             </w:r>
             <w:r>
               <w:rPr>
@@ -5222,13 +4781,12 @@
                 <w:szCs w:val="28"/>
                 <w:lang w:val="fr-FR"/>
               </w:rPr>
-              <w:lastRenderedPageBreak/>
               <w:t>6.1) le compte est désactivé :</w:t>
             </w:r>
           </w:p>
           <w:p>
             <w:pPr>
-              <w:pStyle w:val="Paragraphedeliste"/>
+              <w:pStyle w:val="ListParagraph"/>
               <w:numPr>
                 <w:ilvl w:val="0"/>
                 <w:numId w:val="17"/>
@@ -5267,28 +4825,18 @@
                 <w:lang w:val="fr-FR"/>
               </w:rPr>
             </w:pPr>
-            <w:proofErr w:type="gramStart"/>
-            <w:r>
-              <w:rPr>
-                <w:sz w:val="28"/>
-                <w:szCs w:val="28"/>
-                <w:lang w:val="fr-FR"/>
-              </w:rPr>
-              <w:t>6.2)le</w:t>
-            </w:r>
-            <w:proofErr w:type="gramEnd"/>
-            <w:r>
-              <w:rPr>
-                <w:sz w:val="28"/>
-                <w:szCs w:val="28"/>
-                <w:lang w:val="fr-FR"/>
-              </w:rPr>
-              <w:t xml:space="preserve"> compte est non activé :</w:t>
-            </w:r>
-          </w:p>
-          <w:p>
-            <w:pPr>
-              <w:pStyle w:val="Paragraphedeliste"/>
+            <w:r>
+              <w:rPr>
+                <w:sz w:val="28"/>
+                <w:szCs w:val="28"/>
+                <w:lang w:val="fr-FR"/>
+              </w:rPr>
+              <w:t>6.2)le compte est non activé :</w:t>
+            </w:r>
+          </w:p>
+          <w:p>
+            <w:pPr>
+              <w:pStyle w:val="ListParagraph"/>
               <w:numPr>
                 <w:ilvl w:val="0"/>
                 <w:numId w:val="17"/>
@@ -5357,7 +4905,7 @@
     </w:p>
     <w:tbl>
       <w:tblPr>
-        <w:tblStyle w:val="Grilledutableau"/>
+        <w:tblStyle w:val="TableGrid"/>
         <w:tblW w:w="11482" w:type="dxa"/>
         <w:tblInd w:w="-1281" w:type="dxa"/>
         <w:tblLook w:val="04A0" w:firstRow="1" w:lastRow="0" w:firstColumn="1" w:lastColumn="0" w:noHBand="0" w:noVBand="1"/>
@@ -5402,7 +4950,6 @@
               </w:rPr>
             </w:pPr>
             <w:proofErr w:type="spellStart"/>
-            <w:proofErr w:type="gramStart"/>
             <w:r>
               <w:rPr>
                 <w:sz w:val="28"/>
@@ -5412,7 +4959,6 @@
               <w:t>modifer</w:t>
             </w:r>
             <w:proofErr w:type="spellEnd"/>
-            <w:proofErr w:type="gramEnd"/>
             <w:r>
               <w:rPr>
                 <w:sz w:val="28"/>
@@ -5470,7 +5016,6 @@
                 <w:lang w:val="fr-FR"/>
               </w:rPr>
             </w:pPr>
-            <w:proofErr w:type="gramStart"/>
             <w:r>
               <w:rPr>
                 <w:sz w:val="28"/>
@@ -5485,27 +5030,17 @@
                 <w:szCs w:val="28"/>
                 <w:lang w:val="fr-FR"/>
               </w:rPr>
-              <w:t>tilisateur</w:t>
-            </w:r>
-            <w:proofErr w:type="gramEnd"/>
-            <w:r>
-              <w:rPr>
-                <w:sz w:val="28"/>
-                <w:szCs w:val="28"/>
-                <w:lang w:val="fr-FR"/>
-              </w:rPr>
-              <w:t>(responsable/évaluateur)</w:t>
-            </w:r>
-          </w:p>
-          <w:p>
-            <w:pPr>
-              <w:rPr>
-                <w:sz w:val="28"/>
-                <w:szCs w:val="28"/>
-                <w:lang w:val="fr-FR"/>
-              </w:rPr>
-            </w:pPr>
-            <w:proofErr w:type="gramStart"/>
+              <w:t>tilisateur(responsable/évaluateur)</w:t>
+            </w:r>
+          </w:p>
+          <w:p>
+            <w:pPr>
+              <w:rPr>
+                <w:sz w:val="28"/>
+                <w:szCs w:val="28"/>
+                <w:lang w:val="fr-FR"/>
+              </w:rPr>
+            </w:pPr>
             <w:r>
               <w:rPr>
                 <w:sz w:val="28"/>
@@ -5514,7 +5049,6 @@
               </w:rPr>
               <w:t>administrateur</w:t>
             </w:r>
-            <w:proofErr w:type="gramEnd"/>
           </w:p>
         </w:tc>
       </w:tr>
@@ -6153,7 +5687,6 @@
                 <w:lang w:val="fr-FR"/>
               </w:rPr>
             </w:pPr>
-            <w:proofErr w:type="gramStart"/>
             <w:r>
               <w:rPr>
                 <w:rFonts w:ascii="Segoe UI Emoji" w:hAnsi="Segoe UI Emoji" w:cs="Segoe UI Emoji"/>
@@ -6170,22 +5703,12 @@
                 <w:szCs w:val="28"/>
                 <w:lang w:val="fr-FR"/>
               </w:rPr>
-              <w:t>utilisateur</w:t>
-            </w:r>
-            <w:proofErr w:type="gramEnd"/>
-            <w:r>
-              <w:rPr>
-                <w:rFonts w:ascii="Segoe UI Emoji" w:hAnsi="Segoe UI Emoji" w:cs="Segoe UI Emoji"/>
-                <w:sz w:val="28"/>
-                <w:szCs w:val="28"/>
-                <w:lang w:val="fr-FR"/>
-              </w:rPr>
-              <w:t xml:space="preserve"> annule la modification</w:t>
-            </w:r>
-          </w:p>
-          <w:p>
-            <w:pPr>
-              <w:pStyle w:val="Paragraphedeliste"/>
+              <w:t>utilisateur annule la modification</w:t>
+            </w:r>
+          </w:p>
+          <w:p>
+            <w:pPr>
+              <w:pStyle w:val="ListParagraph"/>
               <w:numPr>
                 <w:ilvl w:val="0"/>
                 <w:numId w:val="17"/>
@@ -6198,7 +5721,6 @@
               </w:rPr>
             </w:pPr>
             <w:proofErr w:type="spellStart"/>
-            <w:proofErr w:type="gramStart"/>
             <w:r>
               <w:rPr>
                 <w:rFonts w:ascii="Segoe UI Emoji" w:hAnsi="Segoe UI Emoji" w:cs="Segoe UI Emoji"/>
@@ -6218,7 +5740,6 @@
               <w:t>ystéme</w:t>
             </w:r>
             <w:proofErr w:type="spellEnd"/>
-            <w:proofErr w:type="gramEnd"/>
             <w:r>
               <w:rPr>
                 <w:rFonts w:ascii="Segoe UI Emoji" w:hAnsi="Segoe UI Emoji" w:cs="Segoe UI Emoji"/>
@@ -6270,22 +5791,12 @@
                 <w:szCs w:val="28"/>
                 <w:lang w:val="fr-FR"/>
               </w:rPr>
-              <w:t xml:space="preserve">Champs obligatoires non </w:t>
-            </w:r>
-            <w:proofErr w:type="gramStart"/>
-            <w:r>
-              <w:rPr>
-                <w:sz w:val="28"/>
-                <w:szCs w:val="28"/>
-                <w:lang w:val="fr-FR"/>
-              </w:rPr>
-              <w:t>remplis:</w:t>
-            </w:r>
-            <w:proofErr w:type="gramEnd"/>
-          </w:p>
-          <w:p>
-            <w:pPr>
-              <w:pStyle w:val="Paragraphedeliste"/>
+              <w:t>Champs obligatoires non remplis:</w:t>
+            </w:r>
+          </w:p>
+          <w:p>
+            <w:pPr>
+              <w:pStyle w:val="ListParagraph"/>
               <w:numPr>
                 <w:ilvl w:val="0"/>
                 <w:numId w:val="17"/>
@@ -6296,23 +5807,13 @@
                 <w:lang w:val="fr-FR"/>
               </w:rPr>
             </w:pPr>
-            <w:proofErr w:type="gramStart"/>
-            <w:r>
-              <w:rPr>
-                <w:sz w:val="28"/>
-                <w:szCs w:val="28"/>
-                <w:lang w:val="fr-FR"/>
-              </w:rPr>
-              <w:t>système</w:t>
-            </w:r>
-            <w:proofErr w:type="gramEnd"/>
-            <w:r>
-              <w:rPr>
-                <w:sz w:val="28"/>
-                <w:szCs w:val="28"/>
-                <w:lang w:val="fr-FR"/>
-              </w:rPr>
-              <w:t xml:space="preserve"> affiche un message d’erreur</w:t>
+            <w:r>
+              <w:rPr>
+                <w:sz w:val="28"/>
+                <w:szCs w:val="28"/>
+                <w:lang w:val="fr-FR"/>
+              </w:rPr>
+              <w:t>système affiche un message d’erreur</w:t>
             </w:r>
           </w:p>
           <w:p>
@@ -6324,7 +5825,6 @@
                 <w:lang w:val="fr-FR"/>
               </w:rPr>
             </w:pPr>
-            <w:proofErr w:type="gramStart"/>
             <w:r>
               <w:rPr>
                 <w:sz w:val="28"/>
@@ -6347,16 +5847,7 @@
                 <w:szCs w:val="28"/>
                 <w:lang w:val="fr-FR"/>
               </w:rPr>
-              <w:t>Données</w:t>
-            </w:r>
-            <w:proofErr w:type="gramEnd"/>
-            <w:r>
-              <w:rPr>
-                <w:sz w:val="28"/>
-                <w:szCs w:val="28"/>
-                <w:lang w:val="fr-FR"/>
-              </w:rPr>
-              <w:t xml:space="preserve"> invalides</w:t>
+              <w:t>Données invalides</w:t>
             </w:r>
             <w:r>
               <w:rPr>
@@ -6369,7 +5860,7 @@
           </w:p>
           <w:p>
             <w:pPr>
-              <w:pStyle w:val="Paragraphedeliste"/>
+              <w:pStyle w:val="ListParagraph"/>
               <w:numPr>
                 <w:ilvl w:val="0"/>
                 <w:numId w:val="17"/>
@@ -6381,7 +5872,6 @@
               </w:rPr>
             </w:pPr>
             <w:proofErr w:type="spellStart"/>
-            <w:proofErr w:type="gramStart"/>
             <w:r>
               <w:rPr>
                 <w:sz w:val="28"/>
@@ -6399,32 +5889,13 @@
               <w:t>éme</w:t>
             </w:r>
             <w:proofErr w:type="spellEnd"/>
-            <w:proofErr w:type="gramEnd"/>
-            <w:r>
-              <w:rPr>
-                <w:sz w:val="28"/>
-                <w:szCs w:val="28"/>
-                <w:lang w:val="fr-FR"/>
-              </w:rPr>
-              <w:t xml:space="preserve"> affiche un </w:t>
-            </w:r>
-            <w:proofErr w:type="gramStart"/>
-            <w:r>
-              <w:rPr>
-                <w:sz w:val="28"/>
-                <w:szCs w:val="28"/>
-                <w:lang w:val="fr-FR"/>
-              </w:rPr>
-              <w:t>alerte  «</w:t>
-            </w:r>
-            <w:proofErr w:type="gramEnd"/>
-            <w:r>
-              <w:rPr>
-                <w:sz w:val="28"/>
-                <w:szCs w:val="28"/>
-                <w:lang w:val="fr-FR"/>
-              </w:rPr>
-              <w:t> </w:t>
+            <w:r>
+              <w:rPr>
+                <w:sz w:val="28"/>
+                <w:szCs w:val="28"/>
+                <w:lang w:val="fr-FR"/>
+              </w:rPr>
+              <w:t xml:space="preserve"> affiche un alerte  « </w:t>
             </w:r>
             <w:r>
               <w:rPr>
@@ -6500,7 +5971,6 @@
           <w:szCs w:val="28"/>
           <w:lang w:val="fr-FR"/>
         </w:rPr>
-        <w:lastRenderedPageBreak/>
         <w:t xml:space="preserve">2.5/CU </w:t>
       </w:r>
       <w:r>
@@ -6559,7 +6029,7 @@
     </w:p>
     <w:tbl>
       <w:tblPr>
-        <w:tblStyle w:val="Grilledutableau"/>
+        <w:tblStyle w:val="TableGrid"/>
         <w:tblW w:w="11482" w:type="dxa"/>
         <w:tblInd w:w="-1281" w:type="dxa"/>
         <w:tblLook w:val="04A0" w:firstRow="1" w:lastRow="0" w:firstColumn="1" w:lastColumn="0" w:noHBand="0" w:noVBand="1"/>
@@ -6603,7 +6073,6 @@
                 <w:lang w:val="fr-FR"/>
               </w:rPr>
             </w:pPr>
-            <w:proofErr w:type="gramStart"/>
             <w:r>
               <w:rPr>
                 <w:sz w:val="28"/>
@@ -6612,7 +6081,6 @@
               </w:rPr>
               <w:t>valider</w:t>
             </w:r>
-            <w:proofErr w:type="gramEnd"/>
             <w:r>
               <w:rPr>
                 <w:sz w:val="28"/>
@@ -6666,16 +6134,7 @@
                 <w:szCs w:val="28"/>
                 <w:lang w:val="fr-FR"/>
               </w:rPr>
-              <w:t>Acteur principale</w:t>
-            </w:r>
-            <w:proofErr w:type="gramStart"/>
-            <w:r>
-              <w:rPr>
-                <w:sz w:val="28"/>
-                <w:szCs w:val="28"/>
-                <w:lang w:val="fr-FR"/>
-              </w:rPr>
-              <w:t> :</w:t>
+              <w:t>Acteur principale :</w:t>
             </w:r>
             <w:r>
               <w:rPr>
@@ -6685,41 +6144,22 @@
               </w:rPr>
               <w:t>Administrateur</w:t>
             </w:r>
-            <w:proofErr w:type="gramEnd"/>
-          </w:p>
-          <w:p>
-            <w:pPr>
-              <w:rPr>
-                <w:sz w:val="28"/>
-                <w:szCs w:val="28"/>
-                <w:lang w:val="fr-FR"/>
-              </w:rPr>
-            </w:pPr>
-            <w:r>
-              <w:rPr>
-                <w:sz w:val="28"/>
-                <w:szCs w:val="28"/>
-                <w:lang w:val="fr-FR"/>
-              </w:rPr>
-              <w:t>Acteur secondaire</w:t>
-            </w:r>
-            <w:proofErr w:type="gramStart"/>
-            <w:r>
-              <w:rPr>
-                <w:sz w:val="28"/>
-                <w:szCs w:val="28"/>
-                <w:lang w:val="fr-FR"/>
-              </w:rPr>
-              <w:t> :Email</w:t>
-            </w:r>
-            <w:proofErr w:type="gramEnd"/>
-            <w:r>
-              <w:rPr>
-                <w:sz w:val="28"/>
-                <w:szCs w:val="28"/>
-                <w:lang w:val="fr-FR"/>
-              </w:rPr>
-              <w:t xml:space="preserve"> </w:t>
+          </w:p>
+          <w:p>
+            <w:pPr>
+              <w:rPr>
+                <w:sz w:val="28"/>
+                <w:szCs w:val="28"/>
+                <w:lang w:val="fr-FR"/>
+              </w:rPr>
+            </w:pPr>
+            <w:r>
+              <w:rPr>
+                <w:sz w:val="28"/>
+                <w:szCs w:val="28"/>
+                <w:lang w:val="fr-FR"/>
+              </w:rPr>
+              <w:t xml:space="preserve">Acteur secondaire :Email </w:t>
             </w:r>
             <w:proofErr w:type="spellStart"/>
             <w:r>
@@ -7117,7 +6557,7 @@
           </w:tcPr>
           <w:p>
             <w:pPr>
-              <w:pStyle w:val="Paragraphedeliste"/>
+              <w:pStyle w:val="ListParagraph"/>
               <w:numPr>
                 <w:ilvl w:val="0"/>
                 <w:numId w:val="23"/>
@@ -7163,7 +6603,7 @@
           </w:p>
           <w:p>
             <w:pPr>
-              <w:pStyle w:val="Paragraphedeliste"/>
+              <w:pStyle w:val="ListParagraph"/>
               <w:numPr>
                 <w:ilvl w:val="0"/>
                 <w:numId w:val="23"/>
@@ -7185,7 +6625,7 @@
           </w:p>
           <w:p>
             <w:pPr>
-              <w:pStyle w:val="Paragraphedeliste"/>
+              <w:pStyle w:val="ListParagraph"/>
               <w:numPr>
                 <w:ilvl w:val="0"/>
                 <w:numId w:val="23"/>
@@ -7233,7 +6673,7 @@
           </w:p>
           <w:p>
             <w:pPr>
-              <w:pStyle w:val="Paragraphedeliste"/>
+              <w:pStyle w:val="ListParagraph"/>
               <w:numPr>
                 <w:ilvl w:val="0"/>
                 <w:numId w:val="23"/>
@@ -7292,22 +6732,12 @@
                 <w:szCs w:val="28"/>
                 <w:lang w:val="fr-FR"/>
               </w:rPr>
-              <w:t xml:space="preserve">t à jour le statut de demande dans </w:t>
-            </w:r>
-            <w:proofErr w:type="gramStart"/>
-            <w:r>
-              <w:rPr>
-                <w:sz w:val="28"/>
-                <w:szCs w:val="28"/>
-                <w:lang w:val="fr-FR"/>
-              </w:rPr>
-              <w:t>le base</w:t>
-            </w:r>
-            <w:proofErr w:type="gramEnd"/>
-          </w:p>
-          <w:p>
-            <w:pPr>
-              <w:pStyle w:val="Paragraphedeliste"/>
+              <w:t>t à jour le statut de demande dans le base</w:t>
+            </w:r>
+          </w:p>
+          <w:p>
+            <w:pPr>
+              <w:pStyle w:val="ListParagraph"/>
               <w:numPr>
                 <w:ilvl w:val="0"/>
                 <w:numId w:val="23"/>
@@ -7363,7 +6793,7 @@
           </w:p>
           <w:p>
             <w:pPr>
-              <w:pStyle w:val="Paragraphedeliste"/>
+              <w:pStyle w:val="ListParagraph"/>
               <w:numPr>
                 <w:ilvl w:val="0"/>
                 <w:numId w:val="23"/>
@@ -7403,7 +6833,7 @@
           </w:p>
           <w:p>
             <w:pPr>
-              <w:pStyle w:val="Paragraphedeliste"/>
+              <w:pStyle w:val="ListParagraph"/>
               <w:numPr>
                 <w:ilvl w:val="0"/>
                 <w:numId w:val="23"/>
@@ -7488,7 +6918,6 @@
                 <w:lang w:val="fr-FR"/>
               </w:rPr>
             </w:pPr>
-            <w:proofErr w:type="gramStart"/>
             <w:r>
               <w:rPr>
                 <w:rFonts w:ascii="Segoe UI Emoji" w:hAnsi="Segoe UI Emoji" w:cs="Segoe UI Emoji"/>
@@ -7514,22 +6943,12 @@
                 <w:szCs w:val="28"/>
                 <w:lang w:val="fr-FR"/>
               </w:rPr>
-              <w:t>)demande</w:t>
-            </w:r>
-            <w:proofErr w:type="gramEnd"/>
-            <w:r>
-              <w:rPr>
-                <w:rFonts w:ascii="Segoe UI Emoji" w:hAnsi="Segoe UI Emoji" w:cs="Segoe UI Emoji"/>
-                <w:sz w:val="28"/>
-                <w:szCs w:val="28"/>
-                <w:lang w:val="fr-FR"/>
-              </w:rPr>
-              <w:t xml:space="preserve"> déjà traitée :</w:t>
-            </w:r>
-          </w:p>
-          <w:p>
-            <w:pPr>
-              <w:pStyle w:val="Paragraphedeliste"/>
+              <w:t>)demande déjà traitée :</w:t>
+            </w:r>
+          </w:p>
+          <w:p>
+            <w:pPr>
+              <w:pStyle w:val="ListParagraph"/>
               <w:numPr>
                 <w:ilvl w:val="0"/>
                 <w:numId w:val="17"/>
@@ -7542,7 +6961,6 @@
               </w:rPr>
             </w:pPr>
             <w:proofErr w:type="spellStart"/>
-            <w:proofErr w:type="gramStart"/>
             <w:r>
               <w:rPr>
                 <w:rFonts w:ascii="Segoe UI Emoji" w:hAnsi="Segoe UI Emoji" w:cs="Segoe UI Emoji"/>
@@ -7571,7 +6989,6 @@
               <w:t>éme</w:t>
             </w:r>
             <w:proofErr w:type="spellEnd"/>
-            <w:proofErr w:type="gramEnd"/>
             <w:r>
               <w:rPr>
                 <w:rFonts w:ascii="Segoe UI Emoji" w:hAnsi="Segoe UI Emoji" w:cs="Segoe UI Emoji"/>
@@ -7579,27 +6996,7 @@
                 <w:szCs w:val="28"/>
                 <w:lang w:val="fr-FR"/>
               </w:rPr>
-              <w:t xml:space="preserve"> affiche un message</w:t>
-            </w:r>
-            <w:proofErr w:type="gramStart"/>
-            <w:r>
-              <w:rPr>
-                <w:rFonts w:ascii="Segoe UI Emoji" w:hAnsi="Segoe UI Emoji" w:cs="Segoe UI Emoji"/>
-                <w:sz w:val="28"/>
-                <w:szCs w:val="28"/>
-                <w:lang w:val="fr-FR"/>
-              </w:rPr>
-              <w:t xml:space="preserve"> «déjà</w:t>
-            </w:r>
-            <w:proofErr w:type="gramEnd"/>
-            <w:r>
-              <w:rPr>
-                <w:rFonts w:ascii="Segoe UI Emoji" w:hAnsi="Segoe UI Emoji" w:cs="Segoe UI Emoji"/>
-                <w:sz w:val="28"/>
-                <w:szCs w:val="28"/>
-                <w:lang w:val="fr-FR"/>
-              </w:rPr>
-              <w:t xml:space="preserve"> traitée »</w:t>
+              <w:t xml:space="preserve"> affiche un message «déjà traitée »</w:t>
             </w:r>
           </w:p>
         </w:tc>
@@ -7733,7 +7130,7 @@
     </w:p>
     <w:tbl>
       <w:tblPr>
-        <w:tblStyle w:val="Grilledutableau"/>
+        <w:tblStyle w:val="TableGrid"/>
         <w:tblW w:w="11482" w:type="dxa"/>
         <w:tblInd w:w="-1281" w:type="dxa"/>
         <w:tblLook w:val="04A0" w:firstRow="1" w:lastRow="0" w:firstColumn="1" w:lastColumn="0" w:noHBand="0" w:noVBand="1"/>
@@ -7777,23 +7174,13 @@
                 <w:lang w:val="fr-FR"/>
               </w:rPr>
             </w:pPr>
-            <w:proofErr w:type="gramStart"/>
-            <w:r>
-              <w:rPr>
-                <w:sz w:val="28"/>
-                <w:szCs w:val="28"/>
-                <w:lang w:val="fr-FR"/>
-              </w:rPr>
-              <w:t>refuser</w:t>
-            </w:r>
-            <w:proofErr w:type="gramEnd"/>
-            <w:r>
-              <w:rPr>
-                <w:sz w:val="28"/>
-                <w:szCs w:val="28"/>
-                <w:lang w:val="fr-FR"/>
-              </w:rPr>
-              <w:t xml:space="preserve"> demande création</w:t>
+            <w:r>
+              <w:rPr>
+                <w:sz w:val="28"/>
+                <w:szCs w:val="28"/>
+                <w:lang w:val="fr-FR"/>
+              </w:rPr>
+              <w:t>refuser demande création</w:t>
             </w:r>
           </w:p>
         </w:tc>
@@ -7840,18 +7227,8 @@
                 <w:szCs w:val="28"/>
                 <w:lang w:val="fr-FR"/>
               </w:rPr>
-              <w:t>Acteur principale</w:t>
-            </w:r>
-            <w:proofErr w:type="gramStart"/>
-            <w:r>
-              <w:rPr>
-                <w:sz w:val="28"/>
-                <w:szCs w:val="28"/>
-                <w:lang w:val="fr-FR"/>
-              </w:rPr>
-              <w:t> :Administrateur</w:t>
-            </w:r>
-            <w:proofErr w:type="gramEnd"/>
+              <w:t>Acteur principale :Administrateur</w:t>
+            </w:r>
           </w:p>
         </w:tc>
       </w:tr>
@@ -8223,25 +7600,7 @@
                 <w:szCs w:val="28"/>
                 <w:lang w:val="fr-FR"/>
               </w:rPr>
-              <w:t xml:space="preserve">’administrateur choisit </w:t>
-            </w:r>
-            <w:proofErr w:type="gramStart"/>
-            <w:r>
-              <w:rPr>
-                <w:sz w:val="28"/>
-                <w:szCs w:val="28"/>
-                <w:lang w:val="fr-FR"/>
-              </w:rPr>
-              <w:t>un demande</w:t>
-            </w:r>
-            <w:proofErr w:type="gramEnd"/>
-            <w:r>
-              <w:rPr>
-                <w:sz w:val="28"/>
-                <w:szCs w:val="28"/>
-                <w:lang w:val="fr-FR"/>
-              </w:rPr>
-              <w:t xml:space="preserve"> en attente</w:t>
+              <w:t>’administrateur choisit un demande en attente</w:t>
             </w:r>
           </w:p>
           <w:p>
@@ -8395,23 +7754,13 @@
                 <w:lang w:val="fr-FR"/>
               </w:rPr>
             </w:pPr>
-            <w:proofErr w:type="gramStart"/>
-            <w:r>
-              <w:rPr>
-                <w:sz w:val="28"/>
-                <w:szCs w:val="28"/>
-                <w:lang w:val="fr-FR"/>
-              </w:rPr>
-              <w:t>.L’administrateur</w:t>
-            </w:r>
-            <w:proofErr w:type="gramEnd"/>
-            <w:r>
-              <w:rPr>
-                <w:sz w:val="28"/>
-                <w:szCs w:val="28"/>
-                <w:lang w:val="fr-FR"/>
-              </w:rPr>
-              <w:t xml:space="preserve"> confirme l’action</w:t>
+            <w:r>
+              <w:rPr>
+                <w:sz w:val="28"/>
+                <w:szCs w:val="28"/>
+                <w:lang w:val="fr-FR"/>
+              </w:rPr>
+              <w:t>.L’administrateur confirme l’action</w:t>
             </w:r>
           </w:p>
           <w:p>
@@ -8455,18 +7804,8 @@
                 <w:szCs w:val="28"/>
                 <w:lang w:val="fr-FR"/>
               </w:rPr>
-              <w:t xml:space="preserve"> mit à jour le statut de demande dans </w:t>
-            </w:r>
-            <w:proofErr w:type="gramStart"/>
-            <w:r>
-              <w:rPr>
-                <w:sz w:val="28"/>
-                <w:szCs w:val="28"/>
-                <w:lang w:val="fr-FR"/>
-              </w:rPr>
-              <w:t>le base</w:t>
-            </w:r>
-            <w:proofErr w:type="gramEnd"/>
+              <w:t xml:space="preserve"> mit à jour le statut de demande dans le base</w:t>
+            </w:r>
           </w:p>
           <w:p>
             <w:pPr>
@@ -8595,7 +7934,6 @@
                 <w:lang w:val="fr-FR"/>
               </w:rPr>
             </w:pPr>
-            <w:proofErr w:type="gramStart"/>
             <w:r>
               <w:rPr>
                 <w:rFonts w:ascii="Segoe UI Emoji" w:hAnsi="Segoe UI Emoji" w:cs="Segoe UI Emoji"/>
@@ -8630,9 +7968,8 @@
                 <w:szCs w:val="28"/>
                 <w:lang w:val="fr-FR"/>
               </w:rPr>
-              <w:t>Administrateur</w:t>
-            </w:r>
-            <w:proofErr w:type="gramEnd"/>
+              <w:t>Administrateur annule le refus de demande</w:t>
+            </w:r>
             <w:r>
               <w:rPr>
                 <w:rFonts w:ascii="Segoe UI Emoji" w:hAnsi="Segoe UI Emoji" w:cs="Segoe UI Emoji"/>
@@ -8640,21 +7977,12 @@
                 <w:szCs w:val="28"/>
                 <w:lang w:val="fr-FR"/>
               </w:rPr>
-              <w:t xml:space="preserve"> annule le refus de demande</w:t>
-            </w:r>
-            <w:r>
-              <w:rPr>
-                <w:rFonts w:ascii="Segoe UI Emoji" w:hAnsi="Segoe UI Emoji" w:cs="Segoe UI Emoji"/>
-                <w:sz w:val="28"/>
-                <w:szCs w:val="28"/>
-                <w:lang w:val="fr-FR"/>
-              </w:rPr>
               <w:t> :</w:t>
             </w:r>
           </w:p>
           <w:p>
             <w:pPr>
-              <w:pStyle w:val="Paragraphedeliste"/>
+              <w:pStyle w:val="ListParagraph"/>
               <w:numPr>
                 <w:ilvl w:val="0"/>
                 <w:numId w:val="17"/>
@@ -8667,7 +7995,6 @@
               </w:rPr>
             </w:pPr>
             <w:proofErr w:type="spellStart"/>
-            <w:proofErr w:type="gramStart"/>
             <w:r>
               <w:rPr>
                 <w:rFonts w:ascii="Segoe UI Emoji" w:hAnsi="Segoe UI Emoji" w:cs="Segoe UI Emoji"/>
@@ -8687,7 +8014,6 @@
               <w:t>ystéme</w:t>
             </w:r>
             <w:proofErr w:type="spellEnd"/>
-            <w:proofErr w:type="gramEnd"/>
             <w:r>
               <w:rPr>
                 <w:rFonts w:ascii="Segoe UI Emoji" w:hAnsi="Segoe UI Emoji" w:cs="Segoe UI Emoji"/>
@@ -8785,7 +8111,6 @@
           <w:szCs w:val="28"/>
           <w:lang w:val="fr-FR"/>
         </w:rPr>
-        <w:lastRenderedPageBreak/>
         <w:t>3/diagrammes de séquence :</w:t>
       </w:r>
     </w:p>
@@ -9107,18 +8432,7 @@
           <w:szCs w:val="28"/>
           <w:lang w:val="fr-FR"/>
         </w:rPr>
-        <w:t>diagramme de séquence de CU</w:t>
-      </w:r>
-      <w:proofErr w:type="gramStart"/>
-      <w:r>
-        <w:rPr>
-          <w:b/>
-          <w:bCs/>
-          <w:sz w:val="28"/>
-          <w:szCs w:val="28"/>
-          <w:lang w:val="fr-FR"/>
-        </w:rPr>
-        <w:t xml:space="preserve"> «</w:t>
+        <w:t>diagramme de séquence de CU «</w:t>
       </w:r>
       <w:r>
         <w:rPr>
@@ -9128,18 +8442,7 @@
           <w:szCs w:val="28"/>
           <w:lang w:val="fr-FR"/>
         </w:rPr>
-        <w:t>soumettre</w:t>
-      </w:r>
-      <w:proofErr w:type="gramEnd"/>
-      <w:r>
-        <w:rPr>
-          <w:b/>
-          <w:bCs/>
-          <w:sz w:val="28"/>
-          <w:szCs w:val="28"/>
-          <w:lang w:val="fr-FR"/>
-        </w:rPr>
-        <w:t xml:space="preserve"> demande création</w:t>
+        <w:t>soumettre demande création</w:t>
       </w:r>
       <w:r>
         <w:rPr>
@@ -9664,20 +8967,8 @@
           <w:szCs w:val="28"/>
           <w:lang w:val="fr-FR"/>
         </w:rPr>
-        <w:t xml:space="preserve">diagramme de classe de sprint </w:t>
+        <w:t>diagramme de classe de sprint 1:</w:t>
       </w:r>
-      <w:proofErr w:type="gramStart"/>
-      <w:r>
-        <w:rPr>
-          <w:b/>
-          <w:bCs/>
-          <w:sz w:val="28"/>
-          <w:szCs w:val="28"/>
-          <w:lang w:val="fr-FR"/>
-        </w:rPr>
-        <w:t>1:</w:t>
-      </w:r>
-      <w:proofErr w:type="gramEnd"/>
     </w:p>
     <w:p>
       <w:pPr>
@@ -13411,11 +12702,11 @@
     <w:name w:val="Normal"/>
     <w:qFormat/>
   </w:style>
-  <w:style w:type="paragraph" w:styleId="Titre1">
+  <w:style w:type="paragraph" w:styleId="Heading1">
     <w:name w:val="heading 1"/>
     <w:basedOn w:val="Normal"/>
     <w:next w:val="Normal"/>
-    <w:link w:val="Titre1Car"/>
+    <w:link w:val="Heading1Char"/>
     <w:uiPriority w:val="9"/>
     <w:qFormat/>
     <w:rsid w:val="00171007"/>
@@ -13432,11 +12723,11 @@
       <w:szCs w:val="40"/>
     </w:rPr>
   </w:style>
-  <w:style w:type="paragraph" w:styleId="Titre2">
+  <w:style w:type="paragraph" w:styleId="Heading2">
     <w:name w:val="heading 2"/>
     <w:basedOn w:val="Normal"/>
     <w:next w:val="Normal"/>
-    <w:link w:val="Titre2Car"/>
+    <w:link w:val="Heading2Char"/>
     <w:uiPriority w:val="9"/>
     <w:unhideWhenUsed/>
     <w:qFormat/>
@@ -13454,11 +12745,11 @@
       <w:szCs w:val="32"/>
     </w:rPr>
   </w:style>
-  <w:style w:type="paragraph" w:styleId="Titre3">
+  <w:style w:type="paragraph" w:styleId="Heading3">
     <w:name w:val="heading 3"/>
     <w:basedOn w:val="Normal"/>
     <w:next w:val="Normal"/>
-    <w:link w:val="Titre3Car"/>
+    <w:link w:val="Heading3Char"/>
     <w:uiPriority w:val="9"/>
     <w:semiHidden/>
     <w:unhideWhenUsed/>
@@ -13477,11 +12768,11 @@
       <w:szCs w:val="28"/>
     </w:rPr>
   </w:style>
-  <w:style w:type="paragraph" w:styleId="Titre4">
+  <w:style w:type="paragraph" w:styleId="Heading4">
     <w:name w:val="heading 4"/>
     <w:basedOn w:val="Normal"/>
     <w:next w:val="Normal"/>
-    <w:link w:val="Titre4Car"/>
+    <w:link w:val="Heading4Char"/>
     <w:uiPriority w:val="9"/>
     <w:semiHidden/>
     <w:unhideWhenUsed/>
@@ -13500,11 +12791,11 @@
       <w:color w:val="0F4761" w:themeColor="accent1" w:themeShade="BF"/>
     </w:rPr>
   </w:style>
-  <w:style w:type="paragraph" w:styleId="Titre5">
+  <w:style w:type="paragraph" w:styleId="Heading5">
     <w:name w:val="heading 5"/>
     <w:basedOn w:val="Normal"/>
     <w:next w:val="Normal"/>
-    <w:link w:val="Titre5Car"/>
+    <w:link w:val="Heading5Char"/>
     <w:uiPriority w:val="9"/>
     <w:semiHidden/>
     <w:unhideWhenUsed/>
@@ -13521,11 +12812,11 @@
       <w:color w:val="0F4761" w:themeColor="accent1" w:themeShade="BF"/>
     </w:rPr>
   </w:style>
-  <w:style w:type="paragraph" w:styleId="Titre6">
+  <w:style w:type="paragraph" w:styleId="Heading6">
     <w:name w:val="heading 6"/>
     <w:basedOn w:val="Normal"/>
     <w:next w:val="Normal"/>
-    <w:link w:val="Titre6Car"/>
+    <w:link w:val="Heading6Char"/>
     <w:uiPriority w:val="9"/>
     <w:semiHidden/>
     <w:unhideWhenUsed/>
@@ -13544,11 +12835,11 @@
       <w:color w:val="595959" w:themeColor="text1" w:themeTint="A6"/>
     </w:rPr>
   </w:style>
-  <w:style w:type="paragraph" w:styleId="Titre7">
+  <w:style w:type="paragraph" w:styleId="Heading7">
     <w:name w:val="heading 7"/>
     <w:basedOn w:val="Normal"/>
     <w:next w:val="Normal"/>
-    <w:link w:val="Titre7Car"/>
+    <w:link w:val="Heading7Char"/>
     <w:uiPriority w:val="9"/>
     <w:semiHidden/>
     <w:unhideWhenUsed/>
@@ -13565,11 +12856,11 @@
       <w:color w:val="595959" w:themeColor="text1" w:themeTint="A6"/>
     </w:rPr>
   </w:style>
-  <w:style w:type="paragraph" w:styleId="Titre8">
+  <w:style w:type="paragraph" w:styleId="Heading8">
     <w:name w:val="heading 8"/>
     <w:basedOn w:val="Normal"/>
     <w:next w:val="Normal"/>
-    <w:link w:val="Titre8Car"/>
+    <w:link w:val="Heading8Char"/>
     <w:uiPriority w:val="9"/>
     <w:semiHidden/>
     <w:unhideWhenUsed/>
@@ -13588,11 +12879,11 @@
       <w:color w:val="272727" w:themeColor="text1" w:themeTint="D8"/>
     </w:rPr>
   </w:style>
-  <w:style w:type="paragraph" w:styleId="Titre9">
+  <w:style w:type="paragraph" w:styleId="Heading9">
     <w:name w:val="heading 9"/>
     <w:basedOn w:val="Normal"/>
     <w:next w:val="Normal"/>
-    <w:link w:val="Titre9Car"/>
+    <w:link w:val="Heading9Char"/>
     <w:uiPriority w:val="9"/>
     <w:semiHidden/>
     <w:unhideWhenUsed/>
@@ -13609,13 +12900,12 @@
       <w:color w:val="272727" w:themeColor="text1" w:themeTint="D8"/>
     </w:rPr>
   </w:style>
-  <w:style w:type="character" w:default="1" w:styleId="Policepardfaut">
+  <w:style w:type="character" w:default="1" w:styleId="DefaultParagraphFont">
     <w:name w:val="Default Paragraph Font"/>
     <w:uiPriority w:val="1"/>
-    <w:semiHidden/>
     <w:unhideWhenUsed/>
   </w:style>
-  <w:style w:type="table" w:default="1" w:styleId="TableauNormal">
+  <w:style w:type="table" w:default="1" w:styleId="TableNormal">
     <w:name w:val="Normal Table"/>
     <w:uiPriority w:val="99"/>
     <w:semiHidden/>
@@ -13630,16 +12920,16 @@
       </w:tblCellMar>
     </w:tblPr>
   </w:style>
-  <w:style w:type="numbering" w:default="1" w:styleId="Aucuneliste">
+  <w:style w:type="numbering" w:default="1" w:styleId="NoList">
     <w:name w:val="No List"/>
     <w:uiPriority w:val="99"/>
     <w:semiHidden/>
     <w:unhideWhenUsed/>
   </w:style>
-  <w:style w:type="character" w:customStyle="1" w:styleId="Titre1Car">
-    <w:name w:val="Titre 1 Car"/>
-    <w:basedOn w:val="Policepardfaut"/>
-    <w:link w:val="Titre1"/>
+  <w:style w:type="character" w:customStyle="1" w:styleId="Heading1Char">
+    <w:name w:val="Heading 1 Char"/>
+    <w:basedOn w:val="DefaultParagraphFont"/>
+    <w:link w:val="Heading1"/>
     <w:uiPriority w:val="9"/>
     <w:rsid w:val="00171007"/>
     <w:rPr>
@@ -13649,10 +12939,10 @@
       <w:szCs w:val="40"/>
     </w:rPr>
   </w:style>
-  <w:style w:type="character" w:customStyle="1" w:styleId="Titre2Car">
-    <w:name w:val="Titre 2 Car"/>
-    <w:basedOn w:val="Policepardfaut"/>
-    <w:link w:val="Titre2"/>
+  <w:style w:type="character" w:customStyle="1" w:styleId="Heading2Char">
+    <w:name w:val="Heading 2 Char"/>
+    <w:basedOn w:val="DefaultParagraphFont"/>
+    <w:link w:val="Heading2"/>
     <w:uiPriority w:val="9"/>
     <w:rsid w:val="00171007"/>
     <w:rPr>
@@ -13662,10 +12952,10 @@
       <w:szCs w:val="32"/>
     </w:rPr>
   </w:style>
-  <w:style w:type="character" w:customStyle="1" w:styleId="Titre3Car">
-    <w:name w:val="Titre 3 Car"/>
-    <w:basedOn w:val="Policepardfaut"/>
-    <w:link w:val="Titre3"/>
+  <w:style w:type="character" w:customStyle="1" w:styleId="Heading3Char">
+    <w:name w:val="Heading 3 Char"/>
+    <w:basedOn w:val="DefaultParagraphFont"/>
+    <w:link w:val="Heading3"/>
     <w:uiPriority w:val="9"/>
     <w:semiHidden/>
     <w:rsid w:val="00171007"/>
@@ -13676,10 +12966,10 @@
       <w:szCs w:val="28"/>
     </w:rPr>
   </w:style>
-  <w:style w:type="character" w:customStyle="1" w:styleId="Titre4Car">
-    <w:name w:val="Titre 4 Car"/>
-    <w:basedOn w:val="Policepardfaut"/>
-    <w:link w:val="Titre4"/>
+  <w:style w:type="character" w:customStyle="1" w:styleId="Heading4Char">
+    <w:name w:val="Heading 4 Char"/>
+    <w:basedOn w:val="DefaultParagraphFont"/>
+    <w:link w:val="Heading4"/>
     <w:uiPriority w:val="9"/>
     <w:semiHidden/>
     <w:rsid w:val="00171007"/>
@@ -13690,10 +12980,10 @@
       <w:color w:val="0F4761" w:themeColor="accent1" w:themeShade="BF"/>
     </w:rPr>
   </w:style>
-  <w:style w:type="character" w:customStyle="1" w:styleId="Titre5Car">
-    <w:name w:val="Titre 5 Car"/>
-    <w:basedOn w:val="Policepardfaut"/>
-    <w:link w:val="Titre5"/>
+  <w:style w:type="character" w:customStyle="1" w:styleId="Heading5Char">
+    <w:name w:val="Heading 5 Char"/>
+    <w:basedOn w:val="DefaultParagraphFont"/>
+    <w:link w:val="Heading5"/>
     <w:uiPriority w:val="9"/>
     <w:semiHidden/>
     <w:rsid w:val="00171007"/>
@@ -13702,10 +12992,10 @@
       <w:color w:val="0F4761" w:themeColor="accent1" w:themeShade="BF"/>
     </w:rPr>
   </w:style>
-  <w:style w:type="character" w:customStyle="1" w:styleId="Titre6Car">
-    <w:name w:val="Titre 6 Car"/>
-    <w:basedOn w:val="Policepardfaut"/>
-    <w:link w:val="Titre6"/>
+  <w:style w:type="character" w:customStyle="1" w:styleId="Heading6Char">
+    <w:name w:val="Heading 6 Char"/>
+    <w:basedOn w:val="DefaultParagraphFont"/>
+    <w:link w:val="Heading6"/>
     <w:uiPriority w:val="9"/>
     <w:semiHidden/>
     <w:rsid w:val="00171007"/>
@@ -13716,10 +13006,10 @@
       <w:color w:val="595959" w:themeColor="text1" w:themeTint="A6"/>
     </w:rPr>
   </w:style>
-  <w:style w:type="character" w:customStyle="1" w:styleId="Titre7Car">
-    <w:name w:val="Titre 7 Car"/>
-    <w:basedOn w:val="Policepardfaut"/>
-    <w:link w:val="Titre7"/>
+  <w:style w:type="character" w:customStyle="1" w:styleId="Heading7Char">
+    <w:name w:val="Heading 7 Char"/>
+    <w:basedOn w:val="DefaultParagraphFont"/>
+    <w:link w:val="Heading7"/>
     <w:uiPriority w:val="9"/>
     <w:semiHidden/>
     <w:rsid w:val="00171007"/>
@@ -13728,10 +13018,10 @@
       <w:color w:val="595959" w:themeColor="text1" w:themeTint="A6"/>
     </w:rPr>
   </w:style>
-  <w:style w:type="character" w:customStyle="1" w:styleId="Titre8Car">
-    <w:name w:val="Titre 8 Car"/>
-    <w:basedOn w:val="Policepardfaut"/>
-    <w:link w:val="Titre8"/>
+  <w:style w:type="character" w:customStyle="1" w:styleId="Heading8Char">
+    <w:name w:val="Heading 8 Char"/>
+    <w:basedOn w:val="DefaultParagraphFont"/>
+    <w:link w:val="Heading8"/>
     <w:uiPriority w:val="9"/>
     <w:semiHidden/>
     <w:rsid w:val="00171007"/>
@@ -13742,10 +13032,10 @@
       <w:color w:val="272727" w:themeColor="text1" w:themeTint="D8"/>
     </w:rPr>
   </w:style>
-  <w:style w:type="character" w:customStyle="1" w:styleId="Titre9Car">
-    <w:name w:val="Titre 9 Car"/>
-    <w:basedOn w:val="Policepardfaut"/>
-    <w:link w:val="Titre9"/>
+  <w:style w:type="character" w:customStyle="1" w:styleId="Heading9Char">
+    <w:name w:val="Heading 9 Char"/>
+    <w:basedOn w:val="DefaultParagraphFont"/>
+    <w:link w:val="Heading9"/>
     <w:uiPriority w:val="9"/>
     <w:semiHidden/>
     <w:rsid w:val="00171007"/>
@@ -13754,11 +13044,11 @@
       <w:color w:val="272727" w:themeColor="text1" w:themeTint="D8"/>
     </w:rPr>
   </w:style>
-  <w:style w:type="paragraph" w:styleId="Titre">
+  <w:style w:type="paragraph" w:styleId="Title">
     <w:name w:val="Title"/>
     <w:basedOn w:val="Normal"/>
     <w:next w:val="Normal"/>
-    <w:link w:val="TitreCar"/>
+    <w:link w:val="TitleChar"/>
     <w:uiPriority w:val="10"/>
     <w:qFormat/>
     <w:rsid w:val="00171007"/>
@@ -13774,10 +13064,10 @@
       <w:szCs w:val="56"/>
     </w:rPr>
   </w:style>
-  <w:style w:type="character" w:customStyle="1" w:styleId="TitreCar">
-    <w:name w:val="Titre Car"/>
-    <w:basedOn w:val="Policepardfaut"/>
-    <w:link w:val="Titre"/>
+  <w:style w:type="character" w:customStyle="1" w:styleId="TitleChar">
+    <w:name w:val="Title Char"/>
+    <w:basedOn w:val="DefaultParagraphFont"/>
+    <w:link w:val="Title"/>
     <w:uiPriority w:val="10"/>
     <w:rsid w:val="00171007"/>
     <w:rPr>
@@ -13788,11 +13078,11 @@
       <w:szCs w:val="56"/>
     </w:rPr>
   </w:style>
-  <w:style w:type="paragraph" w:styleId="Sous-titre">
+  <w:style w:type="paragraph" w:styleId="Subtitle">
     <w:name w:val="Subtitle"/>
     <w:basedOn w:val="Normal"/>
     <w:next w:val="Normal"/>
-    <w:link w:val="Sous-titreCar"/>
+    <w:link w:val="SubtitleChar"/>
     <w:uiPriority w:val="11"/>
     <w:qFormat/>
     <w:rsid w:val="00171007"/>
@@ -13809,10 +13099,10 @@
       <w:szCs w:val="28"/>
     </w:rPr>
   </w:style>
-  <w:style w:type="character" w:customStyle="1" w:styleId="Sous-titreCar">
-    <w:name w:val="Sous-titre Car"/>
-    <w:basedOn w:val="Policepardfaut"/>
-    <w:link w:val="Sous-titre"/>
+  <w:style w:type="character" w:customStyle="1" w:styleId="SubtitleChar">
+    <w:name w:val="Subtitle Char"/>
+    <w:basedOn w:val="DefaultParagraphFont"/>
+    <w:link w:val="Subtitle"/>
     <w:uiPriority w:val="11"/>
     <w:rsid w:val="00171007"/>
     <w:rPr>
@@ -13823,11 +13113,11 @@
       <w:szCs w:val="28"/>
     </w:rPr>
   </w:style>
-  <w:style w:type="paragraph" w:styleId="Citation">
+  <w:style w:type="paragraph" w:styleId="Quote">
     <w:name w:val="Quote"/>
     <w:basedOn w:val="Normal"/>
     <w:next w:val="Normal"/>
-    <w:link w:val="CitationCar"/>
+    <w:link w:val="QuoteChar"/>
     <w:uiPriority w:val="29"/>
     <w:qFormat/>
     <w:rsid w:val="00171007"/>
@@ -13841,10 +13131,10 @@
       <w:color w:val="404040" w:themeColor="text1" w:themeTint="BF"/>
     </w:rPr>
   </w:style>
-  <w:style w:type="character" w:customStyle="1" w:styleId="CitationCar">
-    <w:name w:val="Citation Car"/>
-    <w:basedOn w:val="Policepardfaut"/>
-    <w:link w:val="Citation"/>
+  <w:style w:type="character" w:customStyle="1" w:styleId="QuoteChar">
+    <w:name w:val="Quote Char"/>
+    <w:basedOn w:val="DefaultParagraphFont"/>
+    <w:link w:val="Quote"/>
     <w:uiPriority w:val="29"/>
     <w:rsid w:val="00171007"/>
     <w:rPr>
@@ -13853,7 +13143,7 @@
       <w:color w:val="404040" w:themeColor="text1" w:themeTint="BF"/>
     </w:rPr>
   </w:style>
-  <w:style w:type="paragraph" w:styleId="Paragraphedeliste">
+  <w:style w:type="paragraph" w:styleId="ListParagraph">
     <w:name w:val="List Paragraph"/>
     <w:basedOn w:val="Normal"/>
     <w:uiPriority w:val="34"/>
@@ -13864,9 +13154,9 @@
       <w:contextualSpacing/>
     </w:pPr>
   </w:style>
-  <w:style w:type="character" w:styleId="Accentuationintense">
+  <w:style w:type="character" w:styleId="IntenseEmphasis">
     <w:name w:val="Intense Emphasis"/>
-    <w:basedOn w:val="Policepardfaut"/>
+    <w:basedOn w:val="DefaultParagraphFont"/>
     <w:uiPriority w:val="21"/>
     <w:qFormat/>
     <w:rsid w:val="00171007"/>
@@ -13876,11 +13166,11 @@
       <w:color w:val="0F4761" w:themeColor="accent1" w:themeShade="BF"/>
     </w:rPr>
   </w:style>
-  <w:style w:type="paragraph" w:styleId="Citationintense">
+  <w:style w:type="paragraph" w:styleId="IntenseQuote">
     <w:name w:val="Intense Quote"/>
     <w:basedOn w:val="Normal"/>
     <w:next w:val="Normal"/>
-    <w:link w:val="CitationintenseCar"/>
+    <w:link w:val="IntenseQuoteChar"/>
     <w:uiPriority w:val="30"/>
     <w:qFormat/>
     <w:rsid w:val="00171007"/>
@@ -13899,10 +13189,10 @@
       <w:color w:val="0F4761" w:themeColor="accent1" w:themeShade="BF"/>
     </w:rPr>
   </w:style>
-  <w:style w:type="character" w:customStyle="1" w:styleId="CitationintenseCar">
-    <w:name w:val="Citation intense Car"/>
-    <w:basedOn w:val="Policepardfaut"/>
-    <w:link w:val="Citationintense"/>
+  <w:style w:type="character" w:customStyle="1" w:styleId="IntenseQuoteChar">
+    <w:name w:val="Intense Quote Char"/>
+    <w:basedOn w:val="DefaultParagraphFont"/>
+    <w:link w:val="IntenseQuote"/>
     <w:uiPriority w:val="30"/>
     <w:rsid w:val="00171007"/>
     <w:rPr>
@@ -13911,9 +13201,9 @@
       <w:color w:val="0F4761" w:themeColor="accent1" w:themeShade="BF"/>
     </w:rPr>
   </w:style>
-  <w:style w:type="character" w:styleId="Rfrenceintense">
+  <w:style w:type="character" w:styleId="IntenseReference">
     <w:name w:val="Intense Reference"/>
-    <w:basedOn w:val="Policepardfaut"/>
+    <w:basedOn w:val="DefaultParagraphFont"/>
     <w:uiPriority w:val="32"/>
     <w:qFormat/>
     <w:rsid w:val="00171007"/>
@@ -13925,9 +13215,9 @@
       <w:spacing w:val="5"/>
     </w:rPr>
   </w:style>
-  <w:style w:type="table" w:styleId="Grilledutableau">
+  <w:style w:type="table" w:styleId="TableGrid">
     <w:name w:val="Table Grid"/>
-    <w:basedOn w:val="TableauNormal"/>
+    <w:basedOn w:val="TableNormal"/>
     <w:uiPriority w:val="39"/>
     <w:rsid w:val="000D4348"/>
     <w:pPr>

</xml_diff>